<commit_message>
test(delivery): verify live Stage A flows and publish smoke evidence (Pck4)
</commit_message>
<xml_diff>
--- a/docs/delivery/STAGE_A.docx
+++ b/docs/delivery/STAGE_A.docx
@@ -256,6 +256,345 @@
     <w:p>
       <w:r>
         <w:t>[презентация без изменений](../../demo/FSP_NIKITA_SUBMISSION.pptx).</w:t>
+      </w:r>
+    </w:p>
+    <w:p>
+      <w:pPr>
+        <w:pStyle w:val="Heading1"/>
+      </w:pPr>
+      <w:r>
+        <w:t>Этап A — деплой и фактический smoke, 21.10.2026</w:t>
+      </w:r>
+    </w:p>
+    <w:p>
+      <w:r>
+        <w:t>Ветка `codex/fsp-mvp`. Прикладной код: `555d69d`, упаковка перед деплоем: `ba34108`.</w:t>
+      </w:r>
+    </w:p>
+    <w:p>
+      <w:r>
+        <w:t>Обновлены **api, web, task-worker** на https://85-137-26-131.sslip.io/.</w:t>
+      </w:r>
+    </w:p>
+    <w:p>
+      <w:r>
+        <w:t>БД/том сохранены; перед деплоем сделан локальный pg_dump. Секреты не коммитились.</w:t>
+      </w:r>
+    </w:p>
+    <w:p>
+      <w:r>
+        <w:t>Все SHA256 Python-модулей контейнера совпали с workspace:</w:t>
+      </w:r>
+    </w:p>
+    <w:p>
+      <w:r>
+        <w:t>[машиночитаемый протокол деплоя](stage-a-deploy.json).</w:t>
+      </w:r>
+    </w:p>
+    <w:p>
+      <w:pPr>
+        <w:pStyle w:val="Heading2"/>
+      </w:pPr>
+      <w:r>
+        <w:t>Команды и результаты</w:t>
+      </w:r>
+    </w:p>
+    <w:p>
+      <w:r>
+        <w:t>```text</w:t>
+      </w:r>
+    </w:p>
+    <w:p>
+      <w:r>
+        <w:t>docker compose build api web task-worker</w:t>
+      </w:r>
+    </w:p>
+    <w:p>
+      <w:r>
+        <w:t>api Built; web Built; task-worker Built; exit 0</w:t>
+      </w:r>
+    </w:p>
+    <w:p>
+      <w:r>
+        <w:t>docker compose up -d --no-deps --wait api web task-worker</w:t>
+      </w:r>
+    </w:p>
+    <w:p>
+      <w:r>
+        <w:t>api Healthy; web Healthy; task-worker Started; exit 0</w:t>
+      </w:r>
+    </w:p>
+    <w:p>
+      <w:r>
+        <w:t>curl -fsS https://85-137-26-131.sslip.io/api/health</w:t>
+      </w:r>
+    </w:p>
+    <w:p>
+      <w:r>
+        <w:t>{"status":"ok","demo":true,"version":"1.0.0"}</w:t>
+      </w:r>
+    </w:p>
+    <w:p>
+      <w:r>
+        <w:t>COOKIE_SECURE=false python3 scripts/run_local.py .venv/bin/pytest tests -q</w:t>
+      </w:r>
+    </w:p>
+    <w:p>
+      <w:r>
+        <w:t>96 passed, 2 warnings</w:t>
+      </w:r>
+    </w:p>
+    <w:p>
+      <w:r>
+        <w:t>COOKIE_SECURE=false python3 scripts/run_local.py .venv/bin/pytest tests/test_employer_tasks.py -q</w:t>
+      </w:r>
+    </w:p>
+    <w:p>
+      <w:r>
+        <w:t>6 passed, 2 warnings</w:t>
+      </w:r>
+    </w:p>
+    <w:p>
+      <w:r>
+        <w:t>npm run build --prefix apps/web</w:t>
+      </w:r>
+    </w:p>
+    <w:p>
+      <w:r>
+        <w:t>tsc -b &amp;&amp; vite build — exit 0, 55 modules transformed</w:t>
+      </w:r>
+    </w:p>
+    <w:p>
+      <w:r>
+        <w:t>node apps/web/tests/formatting.test.mjs</w:t>
+      </w:r>
+    </w:p>
+    <w:p>
+      <w:r>
+        <w:t>55 Russian numeral assertions passed</w:t>
+      </w:r>
+    </w:p>
+    <w:p>
+      <w:r>
+        <w:t>python3 scripts/run_local.py .venv/bin/python scripts/smoke_stage_a.py</w:t>
+      </w:r>
+    </w:p>
+    <w:p>
+      <w:r>
+        <w:t>status: pass; 13 groups of live checks; page_errors: []</w:t>
+      </w:r>
+    </w:p>
+    <w:p>
+      <w:r>
+        <w:t>```</w:t>
+      </w:r>
+    </w:p>
+    <w:p>
+      <w:r>
+        <w:t>Общий health version 1.0.0 — версия API, не банка и не matching.</w:t>
+      </w:r>
+    </w:p>
+    <w:p>
+      <w:r>
+        <w:t>Новый банк **2.1.0**, matching **1.2.0** проверены отдельно в живых ответах API.</w:t>
+      </w:r>
+    </w:p>
+    <w:p>
+      <w:r>
+        <w:t>Worker работает без отдельного healthcheck; его состояние `running`.</w:t>
+      </w:r>
+    </w:p>
+    <w:p>
+      <w:r>
+        <w:t>Предупреждения pytest — deprecated API Starlette/httpx/anyio; тесты прошли.</w:t>
+      </w:r>
+    </w:p>
+    <w:p>
+      <w:r>
+        <w:t>[Точный JSON браузерного прогона](stage-a-smoke.json). Chromium + публичный HTTPS:</w:t>
+      </w:r>
+    </w:p>
+    <w:p>
+      <w:r>
+        <w:t>- Health, точное совпадение живой OpenAPI и сохранённой схемы.</w:t>
+      </w:r>
+    </w:p>
+    <w:p>
+      <w:r>
+        <w:t>- Вход всех трёх review-аккаунтов (без изменения их бизнес-данных).</w:t>
+      </w:r>
+    </w:p>
+    <w:p>
+      <w:r>
+        <w:t>- Q1: ввод → обзор → возврат → reload; черновик также есть на сервере;</w:t>
+      </w:r>
+    </w:p>
+    <w:p>
+      <w:r>
+        <w:t xml:space="preserve">  чужой кандидат не может его изменить, срок прежний, результат не раскрыт.</w:t>
+      </w:r>
+    </w:p>
+    <w:p>
+      <w:r>
+        <w:t>- Q2: выдан банк 2.1.0 с явной подсказкой округления; арифметический кейс 29/32</w:t>
+      </w:r>
+    </w:p>
+    <w:p>
+      <w:r>
+        <w:t xml:space="preserve">  дополнительно покрыт unit-тестом. Исторические результаты не переписывались.</w:t>
+      </w:r>
+    </w:p>
+    <w:p>
+      <w:r>
+        <w:t>- Q3: диалог показывает 7 пропусков из 8; отмена сохраняет active,</w:t>
+      </w:r>
+    </w:p>
+    <w:p>
+      <w:r>
+        <w:t xml:space="preserve">  подтверждение завершает попытку.</w:t>
+      </w:r>
+    </w:p>
+    <w:p>
+      <w:r>
+        <w:t>- Приглашение → принятие → адресные контакты; PDF у другой компании</w:t>
+      </w:r>
+    </w:p>
+    <w:p>
+      <w:r>
+        <w:t xml:space="preserve">  не раскрывает контакт, чужой кандидат получает отказ.</w:t>
+      </w:r>
+    </w:p>
+    <w:p>
+      <w:r>
+        <w:t>- ФСП не меняет грейд; без ФСП нулевой бонус, после демо-победы +6.</w:t>
+      </w:r>
+    </w:p>
+    <w:p>
+      <w:r>
+        <w:t>- Старый снимок сохраняется после нового запроса, скрытый профиль из него исчезает.</w:t>
+      </w:r>
+    </w:p>
+    <w:p>
+      <w:r>
+        <w:t>- Q5: фильтр и раздел восстанавливаются при возврате/reload, снимок доступен,</w:t>
+      </w:r>
+    </w:p>
+    <w:p>
+      <w:r>
+        <w:t xml:space="preserve">  строка слагаемых видна.</w:t>
+      </w:r>
+    </w:p>
+    <w:p>
+      <w:r>
+        <w:t>- Q6: ответ/оценка 85 → пауза → включение: всё ещё одна выдача, прежняя дата;</w:t>
+      </w:r>
+    </w:p>
+    <w:p>
+      <w:r>
+        <w:t xml:space="preserve">  план закрыт после проверки. Будущая граница периода проверена в API-тестах</w:t>
+      </w:r>
+    </w:p>
+    <w:p>
+      <w:r>
+        <w:t xml:space="preserve">  управляемым временем, включая четыре конкурентных worker tick.</w:t>
+      </w:r>
+    </w:p>
+    <w:p>
+      <w:r>
+        <w:t>- Q4: после скрытия профиля обзор сообщает об этом, открытый чат убирает</w:t>
+      </w:r>
+    </w:p>
+    <w:p>
+      <w:r>
+        <w:t xml:space="preserve">  поле сообщения при перепроверке, PDF недоступен.</w:t>
+      </w:r>
+    </w:p>
+    <w:p>
+      <w:r>
+        <w:t>- 390/768/1365 px: нет внешнего горизонтального скролла. Ошибок JS нет.</w:t>
+      </w:r>
+    </w:p>
+    <w:p>
+      <w:r>
+        <w:t>Скрипт добавляет четыре **новых вымышленных demo-пользователя** через локальную</w:t>
+      </w:r>
+    </w:p>
+    <w:p>
+      <w:r>
+        <w:t>БД, затем действует через развернутый API и браузер. Пароли случайны, живут в</w:t>
+      </w:r>
+    </w:p>
+    <w:p>
+      <w:r>
+        <w:t>памяти, не выводятся. В `finally` скрываются только кандидаты текущего прогона;</w:t>
+      </w:r>
+    </w:p>
+    <w:p>
+      <w:r>
+        <w:t>записи не удаляются. Это не проверка регистрации/почты. Для одного успешного</w:t>
+      </w:r>
+    </w:p>
+    <w:p>
+      <w:r>
+        <w:t>теста ответы вычисляет независимый решатель по серверным параметрам; это не</w:t>
+      </w:r>
+    </w:p>
+    <w:p>
+      <w:r>
+        <w:t>оценка знаний человека. Общие review-аккаунты не используются для мутаций.</w:t>
+      </w:r>
+    </w:p>
+    <w:p>
+      <w:r>
+        <w:t>Первый прогон остановился после проверок Q1–Q3/контактов на слишком строгом</w:t>
+      </w:r>
+    </w:p>
+    <w:p>
+      <w:r>
+        <w:t>Playwright exact-label локаторе select. Исправлен только локатор; повтор прошёл.</w:t>
+      </w:r>
+    </w:p>
+    <w:p>
+      <w:r>
+        <w:t>Демонстрационные профили прерванного прогона сняты с публикации.</w:t>
+      </w:r>
+    </w:p>
+    <w:p>
+      <w:pPr>
+        <w:pStyle w:val="Heading2"/>
+      </w:pPr>
+      <w:r>
+        <w:t>Что остаётся</w:t>
+      </w:r>
+    </w:p>
+    <w:p>
+      <w:r>
+        <w:t>Pck5: человеку отправить [готовый текст и ссылки](SUBMISSION_LINKS.md) на прежнюю</w:t>
+      </w:r>
+    </w:p>
+    <w:p>
+      <w:r>
+        <w:t>площадку. Внешняя форма агентом не отправлялась. Питч — отдельный этап B.</w:t>
+      </w:r>
+    </w:p>
+    <w:p>
+      <w:r>
+        <w:t>not_run: реальный SMTP в этой сессии, официальный ФСП, пилот на людях/внешняя</w:t>
+      </w:r>
+    </w:p>
+    <w:p>
+      <w:r>
+        <w:t>экспертная разметка, новое нагрузочное измерение, ожидание семи календарных дней.</w:t>
+      </w:r>
+    </w:p>
+    <w:p>
+      <w:r>
+        <w:t>Синтетические метрики не доказывают рыночное качество. Старый неоднозначный</w:t>
+      </w:r>
+    </w:p>
+    <w:p>
+      <w:r>
+        <w:t>SQL-кейс аудита не пересчитан; новая версия исправляет вновь выдаваемые задания.</w:t>
       </w:r>
     </w:p>
     <w:sectPr>

</xml_diff>

<commit_message>
docs(handoff): record push authentication blocker before external submission
</commit_message>
<xml_diff>
--- a/docs/delivery/STAGE_A.docx
+++ b/docs/delivery/STAGE_A.docx
@@ -87,7 +87,7 @@
     </w:p>
     <w:p>
       <w:r>
-        <w:t>Результаты деплоя и браузерного smoke будут зафиксированы в [STAGE_A_SMOKE.md](STAGE_A_SMOKE.md).</w:t>
+        <w:t>Результаты деплоя и браузерного smoke зафиксированы в [STAGE_A_SMOKE.md](STAGE_A_SMOKE.md).</w:t>
       </w:r>
     </w:p>
     <w:p>
@@ -111,6 +111,11 @@
       </w:pPr>
       <w:r>
         <w:t>Самостоятельная проверка этапа A · 10–15 минут</w:t>
+      </w:r>
+    </w:p>
+    <w:p>
+      <w:r>
+        <w:t>&gt; Перед отправкой: GitHub ещё не обновлён — на сервере нет HTTPS/SSH-авторизации для push. Все изменения и материалы сохранены локально. Сначала выполните `git push origin codex/fsp-mvp` после настройки доступа, затем проверьте ссылки.</w:t>
       </w:r>
     </w:p>
     <w:p>
@@ -569,7 +574,32 @@
     </w:p>
     <w:p>
       <w:r>
-        <w:t>Pck5: человеку отправить [готовый текст и ссылки](SUBMISSION_LINKS.md) на прежнюю</w:t>
+        <w:t>Push в GitHub заблокирован отсутствием авторизации: HTTPS сообщает</w:t>
+      </w:r>
+    </w:p>
+    <w:p>
+      <w:r>
+        <w:t>`could not read Username`, SSH — `Permission denied (publickey)`. Remote не</w:t>
+      </w:r>
+    </w:p>
+    <w:p>
+      <w:r>
+        <w:t>изменён; все коммиты сохранены в локальной codex/fsp-mvp. После настройки доступа:</w:t>
+      </w:r>
+    </w:p>
+    <w:p>
+      <w:r>
+        <w:t>`git push origin codex/fsp-mvp`. До этого новые GitHub-ссылки нельзя считать</w:t>
+      </w:r>
+    </w:p>
+    <w:p>
+      <w:r>
+        <w:t>опубликованными, хотя стенд уже работает на новом коде.</w:t>
+      </w:r>
+    </w:p>
+    <w:p>
+      <w:r>
+        <w:t>Pck5: человеку после push отправить [готовый текст и ссылки](SUBMISSION_LINKS.md) на прежнюю</w:t>
       </w:r>
     </w:p>
     <w:p>

</xml_diff>

<commit_message>
docs(delivery): record final audit, verified artifacts and remaining human acceptance
</commit_message>
<xml_diff>
--- a/docs/delivery/STAGE_A.docx
+++ b/docs/delivery/STAGE_A.docx
@@ -27,7 +27,7 @@
     </w:p>
     <w:p>
       <w:r>
-        <w:t>- Q3: перед завершением с пропусками — модальное подтверждение с количеством пустых заданий и сроком пересдачи. Отмена сохраняет попытку.</w:t>
+        <w:t>- Q3: перед завершением с пропусками — модальное подтверждение с количеством пустых заданий и сроком пересдачи. Отмена сохраняет попытку. Сервер также отклоняет неполную сдачу без явного confirm_incomplete; пустые строки считаются пропусками.</w:t>
       </w:r>
     </w:p>
     <w:p>
@@ -37,12 +37,12 @@
     </w:p>
     <w:p>
       <w:r>
-        <w:t>- Q4: скрытый профиль не обещает попадание в подбор; доступ к диалогу определяется текущим согласием. При отказе поле отправки закрывается.</w:t>
+        <w:t>- Q4: скрытый профиль не обещает попадание в подбор; доступ к диалогу определяется текущим согласием. При отказе поле отправки закрывается. Пустые приглашения и кнопка обзора учитывают заполненность, подтверждённый уровень и публикацию.</w:t>
       </w:r>
     </w:p>
     <w:p>
       <w:r>
-        <w:t>- Q5: различимые анонимные обозначения; сохранение фильтров и контекста во вкладке; компактный список важности навыков; сумма навыки + тест + ФСП и версия формулы; снимки отмечены датой.</w:t>
+        <w:t>- Q5: различимые анонимные обозначения; сохранение фильтров и контекста во вкладке; компактный список важности навыков; сумма навыки + тест + ФСП и версия формулы; снимки отмечены датой. Карточка показывает последний статус приглашения и дату, с переходом к списку приглашений.</w:t>
       </w:r>
     </w:p>
     <w:p>
@@ -107,6 +107,127 @@
     </w:p>
     <w:p>
       <w:pPr>
+        <w:pStyle w:val="Heading2"/>
+      </w:pPr>
+      <w:r>
+        <w:t>Архив: первый adversarial-контроль (08:50 UTC, 21.10.2026) — ИСТОРИЯ, не текущий статус</w:t>
+      </w:r>
+    </w:p>
+    <w:p>
+      <w:r>
+        <w:t>Ниже зафиксирован **прошлый** STOP первой независимой проверки. Эти FAIL **закрыты** последующими коммитами `839930f` / `8af82c4` и подтверждены повторными прогонами (см. актуальный статус ниже). Не читать как действующий запрет на отправку.</w:t>
+      </w:r>
+    </w:p>
+    <w:p>
+      <w:r>
+        <w:t>&lt;details&gt;</w:t>
+      </w:r>
+    </w:p>
+    <w:p>
+      <w:r>
+        <w:t>&lt;summary&gt;Исторический STOP (устарело)&lt;/summary&gt;</w:t>
+      </w:r>
+    </w:p>
+    <w:p>
+      <w:r>
+        <w:t>STOP: этап A нельзя отправлять. Q3 — FAIL по серверному пункту Q3.B.2:</w:t>
+      </w:r>
+    </w:p>
+    <w:p>
+      <w:r>
+        <w:t>submit без confirm закрывает неполную попытку (HTTP 200). Браузерная отмена работает.</w:t>
+      </w:r>
+    </w:p>
+    <w:p>
+      <w:r>
+        <w:t>Pck4 — FAIL по правилу общего контроля, хотя существующий smoke дал 13 зелёных групп.</w:t>
+      </w:r>
+    </w:p>
+    <w:p>
+      <w:r>
+        <w:t>Q4 — FAIL: B05 воспроизведён на опубликованном подтверждённом Junior без приглашений: интерфейс снова предлагает подтвердить навыки и опубликоваться. Полный набор состояний и новый цикл согласия также остаются для ручной проверки.</w:t>
+      </w:r>
+    </w:p>
+    <w:p>
+      <w:r>
+        <w:t>Q5 — PARTIAL: не закрыты глазами ярлыки по всем разделам, статус приглашения, позиция</w:t>
+      </w:r>
+    </w:p>
+    <w:p>
+      <w:r>
+        <w:t>прокрутки, изменённые параметры и сумма видимых вкладов.</w:t>
+      </w:r>
+    </w:p>
+    <w:p>
+      <w:r>
+        <w:t>Q6 — PARTIAL: live pause/resume и управляемое время проверены; дата на экране и</w:t>
+      </w:r>
+    </w:p>
+    <w:p>
+      <w:r>
+        <w:t>реальные семь дней не подтверждены. Pck2 — PARTIAL: GitHub ещё на 2e6d6da.</w:t>
+      </w:r>
+    </w:p>
+    <w:p>
+      <w:r>
+        <w:t>Свежие 96 тестов прошли; P@5 0,80 → 0,80; 36 000 сверок без расхождений.</w:t>
+      </w:r>
+    </w:p>
+    <w:p>
+      <w:r>
+        <w:t>Детали той проверки сохранены в git-истории протоколов.</w:t>
+      </w:r>
+    </w:p>
+    <w:p>
+      <w:r>
+        <w:t>&lt;/details&gt;</w:t>
+      </w:r>
+    </w:p>
+    <w:p>
+      <w:pPr>
+        <w:pStyle w:val="Heading2"/>
+      </w:pPr>
+      <w:r>
+        <w:t>Актуальный статус после исправления Q1 (2026-10-21T10:35:44.229363+00:00)</w:t>
+      </w:r>
+    </w:p>
+    <w:p>
+      <w:r>
+        <w:t>Контрпроба E3 протокола `d4501b9` выявила потерю несохранённого ответа при закрытии вкладки и исчезновение предупреждения. Предыдущее утверждение «всё закрыто» было неверным. Этот STOP теперь относится к истории: после исправления и повторного деплоя отрицательные проверки прошли.</w:t>
+      </w:r>
+    </w:p>
+    <w:p>
+      <w:r>
+        <w:t>- Q1: localStorage по attemptId до подтверждения сервера; ошибка сохраняется между разделами; уход/закрытие требуют подтверждения; возврат, восстановление сети и кнопка повтора отправляют очередь. Более новый ввод не стирается поздним ACK.</w:t>
+      </w:r>
+    </w:p>
+    <w:p>
+      <w:r>
+        <w:t>- Q1–Q7, Pck1/Pck3/Pck4 и регрессии: технические DoD PASS по свежему прогону на `7f3dde4cbe5b17b0f16154e4ede90a91673428f8`. Всего 97 pytest; отдельно 20 целевых; smoke 18 групп, включая failed PUT/leave-confirm/reload/reopen/retry; отдельные HTTP503 и задержанный ACK PASS. Все web-ресурсы и API/worker сверены с кодом. Первый прогон выявил лишний confirm при возврате — исправлен вторым коммитом, проверка повторена.</w:t>
+      </w:r>
+    </w:p>
+    <w:p>
+      <w:r>
+        <w:t>- Pck2: PARTIAL только из-за GitHub auth; реальный push отклонён отсутствием Username. Код и сдача сохранены локально, стенд обновлён.</w:t>
+      </w:r>
+    </w:p>
+    <w:p>
+      <w:r>
+        <w:t>- Pck5: HUMAN_ONLY, внешняя отправка не выполнена. Человеческий протокол не заполнен агентом.</w:t>
+      </w:r>
+    </w:p>
+    <w:p>
+      <w:r>
+        <w:t>Презентация и БД сохранены. SMTP, боевой ФСП, человеческий пилот и календарная неделя не объявляются проверенными.</w:t>
+      </w:r>
+    </w:p>
+    <w:p>
+      <w:r>
+        <w:t>Актуальные протоколы: [VERIFY_STAGE_A_MATRIX.json](VERIFY_STAGE_A_MATRIX.json), [VERIFY_STAGE_A_PROTOCOL.md](VERIFY_STAGE_A_PROTOCOL.md), [HUMAN_VERIFY_PROTOCOL_STAGE_A.md](HUMAN_VERIFY_PROTOCOL_STAGE_A.md).</w:t>
+      </w:r>
+    </w:p>
+    <w:p>
+      <w:pPr>
         <w:pStyle w:val="Heading1"/>
       </w:pPr>
       <w:r>
@@ -115,22 +236,7 @@
     </w:p>
     <w:p>
       <w:r>
-        <w:t>&gt; Перед отправкой: GitHub ещё не обновлён — на сервере нет HTTPS/SSH-авторизации для push. Все изменения и материалы сохранены локально. Сначала выполните `git push origin codex/fsp-mvp` после настройки доступа, затем проверьте ссылки.</w:t>
-      </w:r>
-    </w:p>
-    <w:p>
-      <w:r>
-        <w:t xml:space="preserve">Стенд: https://85-137-26-131.sslip.io/  </w:t>
-      </w:r>
-    </w:p>
-    <w:p>
-      <w:r>
-        <w:t xml:space="preserve">Код: https://github.com/ImmortalDR/CV_hakaton/tree/codex/fsp-mvp  </w:t>
-      </w:r>
-    </w:p>
-    <w:p>
-      <w:r>
-        <w:t>[Что изменено после аудита](CHANGELOG_STAGE_A.md) · [Аудит 20 октября](../final_backlog_2026-10-20/FSP-audit-2026-10-20/findings.json) · [Протокол проверки](STAGE_A_SMOKE.md)</w:t>
+        <w:t>&gt; Перед отправкой: push отложен пользователем 21 октября. Проверенный код и новые документы сохранены локально. Сначала публикация, затем человеческая приёмка и отправка ссылок. [Текущий аудит](FINAL_AUDIT_2026-10-21.md), [чистые сценарные аккаунты](REVIEW_ACCOUNTS_2026-10-21.md).</w:t>
       </w:r>
     </w:p>
     <w:p>
@@ -230,12 +336,12 @@
     </w:p>
     <w:p>
       <w:r>
-        <w:t>разметка, реальный SMTP, длительное наблюдение календарных интервалов, новая</w:t>
+        <w:t>разметка, длительное наблюдение календарных интервалов. Реальный SMTP и изолированная</w:t>
       </w:r>
     </w:p>
     <w:p>
       <w:r>
-        <w:t>нагрузочная проверка. Интервалы проверены управляемым временем и конкуренцией.</w:t>
+        <w:t>нагрузка проверены 21 октября; подробности в финальном аудите. Интервалы проверены управляемым временем и конкуренцией.</w:t>
       </w:r>
     </w:p>
     <w:p>
@@ -264,367 +370,36 @@
       </w:r>
     </w:p>
     <w:p>
+      <w:r>
+        <w:t>Актуальная дополнительная документация: [DOCX](FINAL_REPORT_2026-10-21.docx), [PDF](FINAL_REPORT_2026-10-21.pdf), [точечно обновлённые слайды](../../demo/FSP_FINAL_2026-10-21.pptx).</w:t>
+      </w:r>
+    </w:p>
+    <w:p>
       <w:pPr>
         <w:pStyle w:val="Heading1"/>
       </w:pPr>
       <w:r>
-        <w:t>Этап A — деплой и фактический smoke, 21.10.2026</w:t>
+        <w:t>Проверка этапа A после восстановления черновика</w:t>
       </w:r>
     </w:p>
     <w:p>
       <w:r>
-        <w:t>Ветка `codex/fsp-mvp`. Прикладной код: `555d69d`, упаковка перед деплоем: `ba34108`.</w:t>
+        <w:t>Дата: 2026-10-21T10:35:44.229363+00:00. Код стенда: `7f3dde4cbe5b17b0f16154e4ede90a91673428f8`. Канон: COMPREHENSIVE_STAGE_A_2026-10-21.md + accept B01.</w:t>
       </w:r>
     </w:p>
     <w:p>
       <w:r>
-        <w:t>Обновлены **api, web, task-worker** на https://85-137-26-131.sslip.io/.</w:t>
+        <w:t>97 pytest PASS; 20 отдельных целевых проверок PASS; [smoke](stage-a-smoke.json): 18 групп PASS, page_errors=[]; [контрпроба](evidence/q1-recovery/probe.log): HTTP503, два несохранённых ответа, отмена reload, ручной повтор, поздний ACK и более новый ввод PASS.</w:t>
       </w:r>
     </w:p>
     <w:p>
       <w:r>
-        <w:t>БД/том сохранены; перед деплоем сделан локальный pg_dump. Секреты не коммитились.</w:t>
+        <w:t>Команды и выводы: [VERIFY_STAGE_A_PROTOCOL](VERIFY_STAGE_A_PROTOCOL.md). [Хеши деплоя](evidence/q1-recovery/deploy.json): API/worker равны HEAD, web build равен контейнеру и HTTPS. DB volume сохранён.</w:t>
       </w:r>
     </w:p>
     <w:p>
       <w:r>
-        <w:t>Все SHA256 Python-модулей контейнера совпали с workspace:</w:t>
-      </w:r>
-    </w:p>
-    <w:p>
-      <w:r>
-        <w:t>[машиночитаемый протокол деплоя](stage-a-deploy.json).</w:t>
-      </w:r>
-    </w:p>
-    <w:p>
-      <w:pPr>
-        <w:pStyle w:val="Heading2"/>
-      </w:pPr>
-      <w:r>
-        <w:t>Команды и результаты</w:t>
-      </w:r>
-    </w:p>
-    <w:p>
-      <w:r>
-        <w:t>```text</w:t>
-      </w:r>
-    </w:p>
-    <w:p>
-      <w:r>
-        <w:t>docker compose build api web task-worker</w:t>
-      </w:r>
-    </w:p>
-    <w:p>
-      <w:r>
-        <w:t>api Built; web Built; task-worker Built; exit 0</w:t>
-      </w:r>
-    </w:p>
-    <w:p>
-      <w:r>
-        <w:t>docker compose up -d --no-deps --wait api web task-worker</w:t>
-      </w:r>
-    </w:p>
-    <w:p>
-      <w:r>
-        <w:t>api Healthy; web Healthy; task-worker Started; exit 0</w:t>
-      </w:r>
-    </w:p>
-    <w:p>
-      <w:r>
-        <w:t>curl -fsS https://85-137-26-131.sslip.io/api/health</w:t>
-      </w:r>
-    </w:p>
-    <w:p>
-      <w:r>
-        <w:t>{"status":"ok","demo":true,"version":"1.0.0"}</w:t>
-      </w:r>
-    </w:p>
-    <w:p>
-      <w:r>
-        <w:t>COOKIE_SECURE=false python3 scripts/run_local.py .venv/bin/pytest tests -q</w:t>
-      </w:r>
-    </w:p>
-    <w:p>
-      <w:r>
-        <w:t>96 passed, 2 warnings</w:t>
-      </w:r>
-    </w:p>
-    <w:p>
-      <w:r>
-        <w:t>COOKIE_SECURE=false python3 scripts/run_local.py .venv/bin/pytest tests/test_employer_tasks.py -q</w:t>
-      </w:r>
-    </w:p>
-    <w:p>
-      <w:r>
-        <w:t>6 passed, 2 warnings</w:t>
-      </w:r>
-    </w:p>
-    <w:p>
-      <w:r>
-        <w:t>npm run build --prefix apps/web</w:t>
-      </w:r>
-    </w:p>
-    <w:p>
-      <w:r>
-        <w:t>tsc -b &amp;&amp; vite build — exit 0, 55 modules transformed</w:t>
-      </w:r>
-    </w:p>
-    <w:p>
-      <w:r>
-        <w:t>node apps/web/tests/formatting.test.mjs</w:t>
-      </w:r>
-    </w:p>
-    <w:p>
-      <w:r>
-        <w:t>55 Russian numeral assertions passed</w:t>
-      </w:r>
-    </w:p>
-    <w:p>
-      <w:r>
-        <w:t>python3 scripts/run_local.py .venv/bin/python scripts/smoke_stage_a.py</w:t>
-      </w:r>
-    </w:p>
-    <w:p>
-      <w:r>
-        <w:t>status: pass; 13 groups of live checks; page_errors: []</w:t>
-      </w:r>
-    </w:p>
-    <w:p>
-      <w:r>
-        <w:t>```</w:t>
-      </w:r>
-    </w:p>
-    <w:p>
-      <w:r>
-        <w:t>Общий health version 1.0.0 — версия API, не банка и не matching.</w:t>
-      </w:r>
-    </w:p>
-    <w:p>
-      <w:r>
-        <w:t>Новый банк **2.1.0**, matching **1.2.0** проверены отдельно в живых ответах API.</w:t>
-      </w:r>
-    </w:p>
-    <w:p>
-      <w:r>
-        <w:t>Worker работает без отдельного healthcheck; его состояние `running`.</w:t>
-      </w:r>
-    </w:p>
-    <w:p>
-      <w:r>
-        <w:t>Предупреждения pytest — deprecated API Starlette/httpx/anyio; тесты прошли.</w:t>
-      </w:r>
-    </w:p>
-    <w:p>
-      <w:r>
-        <w:t>[Точный JSON браузерного прогона](stage-a-smoke.json). Chromium + публичный HTTPS:</w:t>
-      </w:r>
-    </w:p>
-    <w:p>
-      <w:r>
-        <w:t>- Health, точное совпадение живой OpenAPI и сохранённой схемы.</w:t>
-      </w:r>
-    </w:p>
-    <w:p>
-      <w:r>
-        <w:t>- Вход всех трёх review-аккаунтов (без изменения их бизнес-данных).</w:t>
-      </w:r>
-    </w:p>
-    <w:p>
-      <w:r>
-        <w:t>- Q1: ввод → обзор → возврат → reload; черновик также есть на сервере;</w:t>
-      </w:r>
-    </w:p>
-    <w:p>
-      <w:r>
-        <w:t xml:space="preserve">  чужой кандидат не может его изменить, срок прежний, результат не раскрыт.</w:t>
-      </w:r>
-    </w:p>
-    <w:p>
-      <w:r>
-        <w:t>- Q2: выдан банк 2.1.0 с явной подсказкой округления; арифметический кейс 29/32</w:t>
-      </w:r>
-    </w:p>
-    <w:p>
-      <w:r>
-        <w:t xml:space="preserve">  дополнительно покрыт unit-тестом. Исторические результаты не переписывались.</w:t>
-      </w:r>
-    </w:p>
-    <w:p>
-      <w:r>
-        <w:t>- Q3: диалог показывает 7 пропусков из 8; отмена сохраняет active,</w:t>
-      </w:r>
-    </w:p>
-    <w:p>
-      <w:r>
-        <w:t xml:space="preserve">  подтверждение завершает попытку.</w:t>
-      </w:r>
-    </w:p>
-    <w:p>
-      <w:r>
-        <w:t>- Приглашение → принятие → адресные контакты; PDF у другой компании</w:t>
-      </w:r>
-    </w:p>
-    <w:p>
-      <w:r>
-        <w:t xml:space="preserve">  не раскрывает контакт, чужой кандидат получает отказ.</w:t>
-      </w:r>
-    </w:p>
-    <w:p>
-      <w:r>
-        <w:t>- ФСП не меняет грейд; без ФСП нулевой бонус, после демо-победы +6.</w:t>
-      </w:r>
-    </w:p>
-    <w:p>
-      <w:r>
-        <w:t>- Старый снимок сохраняется после нового запроса, скрытый профиль из него исчезает.</w:t>
-      </w:r>
-    </w:p>
-    <w:p>
-      <w:r>
-        <w:t>- Q5: фильтр и раздел восстанавливаются при возврате/reload, снимок доступен,</w:t>
-      </w:r>
-    </w:p>
-    <w:p>
-      <w:r>
-        <w:t xml:space="preserve">  строка слагаемых видна.</w:t>
-      </w:r>
-    </w:p>
-    <w:p>
-      <w:r>
-        <w:t>- Q6: ответ/оценка 85 → пауза → включение: всё ещё одна выдача, прежняя дата;</w:t>
-      </w:r>
-    </w:p>
-    <w:p>
-      <w:r>
-        <w:t xml:space="preserve">  план закрыт после проверки. Будущая граница периода проверена в API-тестах</w:t>
-      </w:r>
-    </w:p>
-    <w:p>
-      <w:r>
-        <w:t xml:space="preserve">  управляемым временем, включая четыре конкурентных worker tick.</w:t>
-      </w:r>
-    </w:p>
-    <w:p>
-      <w:r>
-        <w:t>- Q4: после скрытия профиля обзор сообщает об этом, открытый чат убирает</w:t>
-      </w:r>
-    </w:p>
-    <w:p>
-      <w:r>
-        <w:t xml:space="preserve">  поле сообщения при перепроверке, PDF недоступен.</w:t>
-      </w:r>
-    </w:p>
-    <w:p>
-      <w:r>
-        <w:t>- 390/768/1365 px: нет внешнего горизонтального скролла. Ошибок JS нет.</w:t>
-      </w:r>
-    </w:p>
-    <w:p>
-      <w:r>
-        <w:t>Скрипт добавляет четыре **новых вымышленных demo-пользователя** через локальную</w:t>
-      </w:r>
-    </w:p>
-    <w:p>
-      <w:r>
-        <w:t>БД, затем действует через развернутый API и браузер. Пароли случайны, живут в</w:t>
-      </w:r>
-    </w:p>
-    <w:p>
-      <w:r>
-        <w:t>памяти, не выводятся. В `finally` скрываются только кандидаты текущего прогона;</w:t>
-      </w:r>
-    </w:p>
-    <w:p>
-      <w:r>
-        <w:t>записи не удаляются. Это не проверка регистрации/почты. Для одного успешного</w:t>
-      </w:r>
-    </w:p>
-    <w:p>
-      <w:r>
-        <w:t>теста ответы вычисляет независимый решатель по серверным параметрам; это не</w:t>
-      </w:r>
-    </w:p>
-    <w:p>
-      <w:r>
-        <w:t>оценка знаний человека. Общие review-аккаунты не используются для мутаций.</w:t>
-      </w:r>
-    </w:p>
-    <w:p>
-      <w:r>
-        <w:t>Первый прогон остановился после проверок Q1–Q3/контактов на слишком строгом</w:t>
-      </w:r>
-    </w:p>
-    <w:p>
-      <w:r>
-        <w:t>Playwright exact-label локаторе select. Исправлен только локатор; повтор прошёл.</w:t>
-      </w:r>
-    </w:p>
-    <w:p>
-      <w:r>
-        <w:t>Демонстрационные профили прерванного прогона сняты с публикации.</w:t>
-      </w:r>
-    </w:p>
-    <w:p>
-      <w:pPr>
-        <w:pStyle w:val="Heading2"/>
-      </w:pPr>
-      <w:r>
-        <w:t>Что остаётся</w:t>
-      </w:r>
-    </w:p>
-    <w:p>
-      <w:r>
-        <w:t>Push в GitHub заблокирован отсутствием авторизации: HTTPS сообщает</w:t>
-      </w:r>
-    </w:p>
-    <w:p>
-      <w:r>
-        <w:t>`could not read Username`, SSH — `Permission denied (publickey)`. Remote не</w:t>
-      </w:r>
-    </w:p>
-    <w:p>
-      <w:r>
-        <w:t>изменён; все коммиты сохранены в локальной codex/fsp-mvp. После настройки доступа:</w:t>
-      </w:r>
-    </w:p>
-    <w:p>
-      <w:r>
-        <w:t>`git push origin codex/fsp-mvp`. До этого новые GitHub-ссылки нельзя считать</w:t>
-      </w:r>
-    </w:p>
-    <w:p>
-      <w:r>
-        <w:t>опубликованными, хотя стенд уже работает на новом коде.</w:t>
-      </w:r>
-    </w:p>
-    <w:p>
-      <w:r>
-        <w:t>Pck5: человеку после push отправить [готовый текст и ссылки](SUBMISSION_LINKS.md) на прежнюю</w:t>
-      </w:r>
-    </w:p>
-    <w:p>
-      <w:r>
-        <w:t>площадку. Внешняя форма агентом не отправлялась. Питч — отдельный этап B.</w:t>
-      </w:r>
-    </w:p>
-    <w:p>
-      <w:r>
-        <w:t>not_run: реальный SMTP в этой сессии, официальный ФСП, пилот на людях/внешняя</w:t>
-      </w:r>
-    </w:p>
-    <w:p>
-      <w:r>
-        <w:t>экспертная разметка, новое нагрузочное измерение, ожидание семи календарных дней.</w:t>
-      </w:r>
-    </w:p>
-    <w:p>
-      <w:r>
-        <w:t>Синтетические метрики не доказывают рыночное качество. Старый неоднозначный</w:t>
-      </w:r>
-    </w:p>
-    <w:p>
-      <w:r>
-        <w:t>SQL-кейс аудита не пересчитан; новая версия исправляет вновь выдаваемые задания.</w:t>
+        <w:t>Первый цикл поймал лишнее подтверждение при возврате в тест; исправлен во втором. Прежние журналы доступны в git, не являются текущим PASS. Текущая матрица: 14 PASS, 1 PARTIAL (GitHub auth), 1 HUMAN_ONLY (отправка), 0 FAIL. Это не человеческий UX-аудит и не подтверждение отправки на площадку.</w:t>
       </w:r>
     </w:p>
     <w:sectPr>

</xml_diff>

<commit_message>
docs: rewrite jury walkthrough for first-time visitors
</commit_message>
<xml_diff>
--- a/docs/delivery/STAGE_A.docx
+++ b/docs/delivery/STAGE_A.docx
@@ -76,17 +76,81 @@
         <w:pageBreakBefore/>
       </w:pPr>
       <w:r>
-        <w:t>Самостоятельная проверка этапа A · 10–15 минут</w:t>
+        <w:t>ФСП · карьера: знакомство с платформой</w:t>
       </w:r>
     </w:p>
     <w:p>
       <w:r>
-        <w:t>&gt; Комплект сдачи находится в main. Текущий статус (CURRENT_STATUS_2026-10-21.md) · История и проверка объединения (../REPOSITORY.md). Отправка организаторам остаётся действием команды.</w:t>
+        <w:t>Открыть демонстрационный сайт (https://85-137-26-131.sslip.io/)</w:t>
       </w:r>
     </w:p>
     <w:p>
       <w:r>
-        <w:t>Все review-аккаунты общие и демонстрационные. Не вводите реальные данные.</w:t>
+        <w:t>Платформа помогает работодателю найти специалиста по подтверждённым навыкам. Кандидат проходит тест и выбирает, кому открыть контакты. Работодатель видит основания подбора и отправляет личное предложение с зарплатой.</w:t>
+      </w:r>
+    </w:p>
+    <w:p>
+      <w:r>
+        <w:t>На знакомство с готовыми примерами достаточно около 10–15 минут. Регистрация и полное прохождение теста для этого не нужны.</w:t>
+      </w:r>
+    </w:p>
+    <w:p>
+      <w:pPr>
+        <w:pStyle w:val="Heading2"/>
+      </w:pPr>
+      <w:r>
+        <w:t>Перед началом</w:t>
+      </w:r>
+    </w:p>
+    <w:p>
+      <w:r>
+        <w:t>Откройте сайт в двух независимых окнах: обычном и инкогнито либо в двух разных браузерах. Так вы сможете одновременно посмотреть обе роли. Две обычные вкладки одного браузера используют общий вход.</w:t>
+      </w:r>
+    </w:p>
+    <w:p>
+      <w:r>
+        <w:t>На странице входа под формой находятся кнопки «Я кандидат» и «Я работодатель». Нажмите первую в одном окне, вторую — в другом. На телефоне разделы открываются кнопкой «Все разделы».</w:t>
+      </w:r>
+    </w:p>
+    <w:p>
+      <w:r>
+        <w:t>Демоаккаунты общие: в них могут быть результаты и приглашения предыдущих посетителей. Используйте вымышленные данные. Если хотите пройти всё с чистого листа, инструкция есть в конце этой страницы.</w:t>
+      </w:r>
+    </w:p>
+    <w:p>
+      <w:pPr>
+        <w:pStyle w:val="Heading2"/>
+      </w:pPr>
+      <w:r>
+        <w:t>1. Посмотрите, что видит кандидат</w:t>
+      </w:r>
+    </w:p>
+    <w:p>
+      <w:r>
+        <w:t>В окне кандидата откройте «Обзор». Здесь показаны специализация, подтверждённый уровень и видимость профиля для работодателей.</w:t>
+      </w:r>
+    </w:p>
+    <w:p>
+      <w:r>
+        <w:t>Перейдите в «Подтверждение навыков» и откройте доступный результат в истории тестирования. Посмотрите задания, ответы, итоговую оценку и объяснения. В текущем тесте 8 заданий на 30 минут; для подтверждения уровня нужны минимум 6 правильных ответов, из них минимум 3 по основному навыку — Python или SQL.</w:t>
+      </w:r>
+    </w:p>
+    <w:p>
+      <w:r>
+        <w:t>Что показывает этот шаг: уровень опирается на результат теста. Неудачная попытка не понижает уже подтверждённый уровень. Примеры результатов в демопрофилях созданы для демонстрации.</w:t>
+      </w:r>
+    </w:p>
+    <w:p>
+      <w:pPr>
+        <w:pStyle w:val="Heading2"/>
+      </w:pPr>
+      <w:r>
+        <w:t>2. Подберите специалиста от имени компании</w:t>
+      </w:r>
+    </w:p>
+    <w:p>
+      <w:r>
+        <w:t>В окне работодателя откройте «Подбор кандидатов» → «По потребности» и задайте:</w:t>
       </w:r>
     </w:p>
     <w:tbl>
@@ -96,9 +160,8 @@
         <w:tblLook w:firstColumn="1" w:firstRow="1" w:lastColumn="0" w:lastRow="0" w:noHBand="0" w:noVBand="1" w:val="04A0"/>
       </w:tblPr>
       <w:tblGrid>
-        <w:gridCol w:w="2880"/>
-        <w:gridCol w:w="2880"/>
-        <w:gridCol w:w="2880"/>
+        <w:gridCol w:w="4320"/>
+        <w:gridCol w:w="4320"/>
       </w:tblGrid>
       <w:tr>
         <w:trPr>
@@ -107,31 +170,21 @@
         </w:trPr>
         <w:tc>
           <w:tcPr>
-            <w:tcW w:type="dxa" w:w="2880"/>
+            <w:tcW w:type="dxa" w:w="4320"/>
           </w:tcPr>
           <w:p>
             <w:r>
-              <w:t>Роль</w:t>
+              <w:t>Поле</w:t>
             </w:r>
           </w:p>
         </w:tc>
         <w:tc>
           <w:tcPr>
-            <w:tcW w:type="dxa" w:w="2880"/>
+            <w:tcW w:type="dxa" w:w="4320"/>
           </w:tcPr>
           <w:p>
             <w:r>
-              <w:t>Логин</w:t>
-            </w:r>
-          </w:p>
-        </w:tc>
-        <w:tc>
-          <w:tcPr>
-            <w:tcW w:type="dxa" w:w="2880"/>
-          </w:tcPr>
-          <w:p>
-            <w:r>
-              <w:t>Пароль</w:t>
+              <w:t>Значение для примера</w:t>
             </w:r>
           </w:p>
         </w:tc>
@@ -142,31 +195,21 @@
         </w:trPr>
         <w:tc>
           <w:tcPr>
-            <w:tcW w:type="dxa" w:w="2880"/>
+            <w:tcW w:type="dxa" w:w="4320"/>
           </w:tcPr>
           <w:p>
             <w:r>
-              <w:t>Кандидат</w:t>
+              <w:t>Специализация</w:t>
             </w:r>
           </w:p>
         </w:tc>
         <w:tc>
           <w:tcPr>
-            <w:tcW w:type="dxa" w:w="2880"/>
+            <w:tcW w:type="dxa" w:w="4320"/>
           </w:tcPr>
           <w:p>
             <w:r>
-              <w:t>review.candidate.fsp@example.org</w:t>
-            </w:r>
-          </w:p>
-        </w:tc>
-        <w:tc>
-          <w:tcPr>
-            <w:tcW w:type="dxa" w:w="2880"/>
-          </w:tcPr>
-          <w:p>
-            <w:r>
-              <w:t>Review-Cand-2026!</w:t>
+              <w:t>Python / бэкенд</w:t>
             </w:r>
           </w:p>
         </w:tc>
@@ -177,31 +220,21 @@
         </w:trPr>
         <w:tc>
           <w:tcPr>
-            <w:tcW w:type="dxa" w:w="2880"/>
+            <w:tcW w:type="dxa" w:w="4320"/>
           </w:tcPr>
           <w:p>
             <w:r>
-              <w:t>Работодатель</w:t>
+              <w:t>Допустимые уровни</w:t>
             </w:r>
           </w:p>
         </w:tc>
         <w:tc>
           <w:tcPr>
-            <w:tcW w:type="dxa" w:w="2880"/>
+            <w:tcW w:type="dxa" w:w="4320"/>
           </w:tcPr>
           <w:p>
             <w:r>
-              <w:t>review.employer.fsp@example.org</w:t>
-            </w:r>
-          </w:p>
-        </w:tc>
-        <w:tc>
-          <w:tcPr>
-            <w:tcW w:type="dxa" w:w="2880"/>
-          </w:tcPr>
-          <w:p>
-            <w:r>
-              <w:t>Review-Emp-2026!</w:t>
+              <w:t>Junior</w:t>
             </w:r>
           </w:p>
         </w:tc>
@@ -212,31 +245,96 @@
         </w:trPr>
         <w:tc>
           <w:tcPr>
-            <w:tcW w:type="dxa" w:w="2880"/>
+            <w:tcW w:type="dxa" w:w="4320"/>
           </w:tcPr>
           <w:p>
             <w:r>
-              <w:t>Другая компания</w:t>
+              <w:t>Python</w:t>
             </w:r>
           </w:p>
         </w:tc>
         <w:tc>
           <w:tcPr>
-            <w:tcW w:type="dxa" w:w="2880"/>
+            <w:tcW w:type="dxa" w:w="4320"/>
           </w:tcPr>
           <w:p>
             <w:r>
-              <w:t>review.employer2.fsp@example.org</w:t>
+              <w:t>Обязательный</w:t>
+            </w:r>
+          </w:p>
+        </w:tc>
+      </w:tr>
+      <w:tr>
+        <w:trPr>
+          <w:cantSplit/>
+        </w:trPr>
+        <w:tc>
+          <w:tcPr>
+            <w:tcW w:type="dxa" w:w="4320"/>
+          </w:tcPr>
+          <w:p>
+            <w:r>
+              <w:t>Тестирование</w:t>
             </w:r>
           </w:p>
         </w:tc>
         <w:tc>
           <w:tcPr>
-            <w:tcW w:type="dxa" w:w="2880"/>
+            <w:tcW w:type="dxa" w:w="4320"/>
           </w:tcPr>
           <w:p>
             <w:r>
-              <w:t>Review-Emp2-2026!</w:t>
+              <w:t>Желательный</w:t>
+            </w:r>
+          </w:p>
+        </w:tc>
+      </w:tr>
+      <w:tr>
+        <w:trPr>
+          <w:cantSplit/>
+        </w:trPr>
+        <w:tc>
+          <w:tcPr>
+            <w:tcW w:type="dxa" w:w="4320"/>
+          </w:tcPr>
+          <w:p>
+            <w:r>
+              <w:t>HTTP / API</w:t>
+            </w:r>
+          </w:p>
+        </w:tc>
+        <w:tc>
+          <w:tcPr>
+            <w:tcW w:type="dxa" w:w="4320"/>
+          </w:tcPr>
+          <w:p>
+            <w:r>
+              <w:t>Не учитывать</w:t>
+            </w:r>
+          </w:p>
+        </w:tc>
+      </w:tr>
+      <w:tr>
+        <w:trPr>
+          <w:cantSplit/>
+        </w:trPr>
+        <w:tc>
+          <w:tcPr>
+            <w:tcW w:type="dxa" w:w="4320"/>
+          </w:tcPr>
+          <w:p>
+            <w:r>
+              <w:t>Только с достижениями ФСП</w:t>
+            </w:r>
+          </w:p>
+        </w:tc>
+        <w:tc>
+          <w:tcPr>
+            <w:tcW w:type="dxa" w:w="4320"/>
+          </w:tcPr>
+          <w:p>
+            <w:r>
+              <w:t>Не отмечать</w:t>
             </w:r>
           </w:p>
         </w:tc>
@@ -244,107 +342,134 @@
     </w:tbl>
     <w:p>
       <w:r>
-        <w:t>1. Откройте кандидата в отдельном браузерном профиле. В обзоре проверьте публикацию, подтверждённый уровень и достижения ФСП. ФСП не требуется для прохождения теста.</w:t>
+        <w:t>Нажмите «Сформировать подборку». В карточке любого кандидата прочитайте «Почему в подборке» и раскройте «Результаты и источники». Здесь видны подтверждённые навыки, результаты тестирования и составляющие общего балла.</w:t>
       </w:r>
     </w:p>
     <w:p>
       <w:r>
-        <w:t>2. Для нового теста зарегистрируйте отдельный вымышленный аккаунт с доступным вам почтовым ящиком и подтвердите адрес. Имена fresh_python и fresh_sql_middle в сценарных аккаунтах (REVIEW_ACCOUNTS_2026-10-21.md) обозначают первоначальную подготовку: они уже использованы человеком и могут быть на cooldown. Готовый ready_candidate нужен для быстрого показа результата и приглашений: у него уже есть попытка Junior, её срок не сбрасывать. Общие review-аккаунты могут упираться в ограничения.</w:t>
+        <w:t>Теперь сделайте HTTP / API обязательным и снова сформируйте подборку. У кандидата без подтверждения этого навыка появится отметка «Не проверено», а при неполном соответствии обязательным требованиям — пояснение об этом.</w:t>
       </w:r>
     </w:p>
     <w:p>
       <w:r>
-        <w:t>3. Введите ответ, перейдите в обзор, вернитесь и обновите страницу: ответ остаётся, срок не продлевается. Нажмите завершение с пропусками и отмените подтверждение. Новые дробные задания явно указывают округление половины вверх. Полное решение теста не обязательно для проверки этого исправления.</w:t>
+        <w:t>Что показывает этот шаг: система объясняет соответствие запросу и явно обозначает недостающие доказательства. Общий балл помогает сравнивать кандидатов внутри одной категории; он не означает вероятность найма.</w:t>
+      </w:r>
+    </w:p>
+    <w:p>
+      <w:pPr>
+        <w:pStyle w:val="Heading2"/>
+      </w:pPr>
+      <w:r>
+        <w:t>3. Отправьте предложение и посмотрите ответ кандидата</w:t>
       </w:r>
     </w:p>
     <w:p>
       <w:r>
-        <w:t>4. В другом браузерном профиле войдите работодателем. Составьте потребность, сравните кандидатов одной категории: видны доказательства и слагаемые балла. Измените требования: старый снимок отмечен как сохранённый. Вернитесь в раздел — контекст сохраняется.</w:t>
+        <w:t>Верните HTTP / API в «Не учитывать» и сформируйте подборку заново.</w:t>
       </w:r>
     </w:p>
     <w:p>
       <w:r>
-        <w:t>5. Отправьте review-кандидату новое приглашение с зарплатой в рублях. До принятия контакты закрыты. Примите кандидатом; у пригласившей компании контакты открываются. В третьем браузерном профиле другая компания не получает их, в том числе в PDF. Если согласие этой компании уже было дано в общей учётке, сначала отзовите публикацию и включите её снова — старое адресное разрешение не восстановится.</w:t>
+        <w:t>Для проверки обеих сторон на текущем демостенде используйте кандидата №C7D0B82B — это профиль, который открывается кнопкой «Я кандидат». Если компания уже получила доступ к его контактам, вместо номера будет имя; его можно сверить в разделе «Мой профиль» окна кандидата.</w:t>
       </w:r>
     </w:p>
     <w:p>
       <w:r>
-        <w:t>6. Снимите публикацию кандидата: подбор и PDF закрываются; диалог недоступен, поле отправки неактивно/скрыто после обновления. Открытый чат и карточки приглашений перепроверяют доступ каждые 15 секунд; карточки также при фокусе окна.</w:t>
+        <w:t>1. В карточке нажмите «Пригласить». Например, укажите «Разработка API на Python» и зарплату 100 000–150 000 ₽ в месяц. Отправьте приглашение.</w:t>
       </w:r>
     </w:p>
     <w:p>
       <w:r>
-        <w:t>7. Дополнительно: после адресного согласия создайте план заданий с периодом 7 дней, кандидат включает выдачу, отвечает, работодатель оценивает. Пауза и включение не создают вторую выдачу до срока. Оценка компании не меняет грейд.</w:t>
+        <w:t>2. В окне кандидата откройте «Приглашения». Найдите предложение, прочитайте задачи, зарплату и сведения о компании.</w:t>
       </w:r>
     </w:p>
     <w:p>
       <w:r>
-        <w:t>Две измеренные характеристики: P@5 на авторском синтетическом holdout — 0,80 до и после</w:t>
+        <w:t>3. Нажмите «Принять и раскрыть контакты».</w:t>
       </w:r>
     </w:p>
     <w:p>
       <w:r>
-        <w:t>(48 кандидатов, 8 запросов); 36 000 сверок эталонов — 0 расхождений.</w:t>
+        <w:t>4. Вернитесь в окно работодателя, откройте «Приглашения» и обновите страницу. У принятого предложения доступны контакты и кнопка «Открыть диалог».</w:t>
       </w:r>
     </w:p>
     <w:p>
       <w:r>
-        <w:t>Это инженерные проверки на синтетике, не доказательство качества найма на рынке.</w:t>
+        <w:t>5. При желании обменяйтесь короткими тестовыми сообщениями через два окна.</w:t>
       </w:r>
     </w:p>
     <w:p>
       <w:r>
-        <w:t>Выбор весов выполнен на отдельном dev (16 кандидатов, 2 запроса).</w:t>
+        <w:t>Если приглашение уже ожидает ответа, продолжите с него. Если оно уже принято, можно сразу посмотреть открытые контакты и диалог; это результат предыдущего посетителя, а не новое согласие с вашей стороны.</w:t>
       </w:r>
     </w:p>
     <w:p>
       <w:r>
-        <w:t>Данные, процедура и ограничения (VALIDATION.md).</w:t>
+        <w:t>Что показывает этот шаг: кандидат видит условия до начала общения. Контакты открываются пригласившей компании после принятия предложения. В карточке кандидата также можно скачать PDF-профиль; его содержимое зависит от предоставленного компании доступа.</w:t>
+      </w:r>
+    </w:p>
+    <w:p>
+      <w:pPr>
+        <w:pStyle w:val="Heading2"/>
+      </w:pPr>
+      <w:r>
+        <w:t>Что ещё можно посмотреть</w:t>
       </w:r>
     </w:p>
     <w:p>
       <w:r>
-        <w:t>Не выполнено в этой сессии (not_run): человеческий пилот, независимая экспертная</w:t>
+        <w:t>- «Задания от компаний». После принятия приглашения работодатель может предложить короткое задание с критериями и сроком. Кандидат отдельно соглашается на получение заданий. Оценка работодателя не меняет подтверждённый профессиональный уровень.</w:t>
       </w:r>
     </w:p>
     <w:p>
       <w:r>
-        <w:t>разметка, длительное наблюдение календарных интервалов. Реальный SMTP и изолированная</w:t>
+        <w:t>- «Достижения ФСП». Дополнительные достижения учитываются при подборе, но не повышают уровень. Участие в соревнованиях не требуется для использования платформы. На стенде показана демонстрационная интеграция, без подключения к официальному реестру.</w:t>
       </w:r>
     </w:p>
     <w:p>
       <w:r>
-        <w:t>нагрузка проверены 21 октября; подробности в финальном аудите. Интервалы проверены управляемым временем и конкуренцией.</w:t>
+        <w:t>- «Мой профиль». Кандидат управляет публикацией. Её отключение закрывает доступ к профилю, контактам и диалогу; повторная публикация не возвращает старые разрешения автоматически. Проверяйте этот сценарий на собственном тестовом аккаунте, чтобы не прерывать работу других посетителей общего демо.</w:t>
+      </w:r>
+    </w:p>
+    <w:p>
+      <w:pPr>
+        <w:pStyle w:val="Heading2"/>
+      </w:pPr>
+      <w:r>
+        <w:t>Если хотите пройти весь путь самостоятельно</w:t>
       </w:r>
     </w:p>
     <w:p>
       <w:r>
-        <w:t>ФСП — DemoProvider, не официальный реестр. Старые неоднозначные попытки не пересчитаны.</w:t>
+        <w:t>Зарегистрируйте кандидата и работодателя на двух доступных вам почтовых адресах, подтвердите их по ссылкам из писем. Заполните профиль кандидата и компанию работодателя.</w:t>
       </w:r>
     </w:p>
     <w:p>
       <w:r>
-        <w:t>API: https://85-137-26-131.sslip.io/api/openapi.json · сохранённая схема (openapi.json).</w:t>
+        <w:t>У кандидата пройдите тест выбранного уровня, затем разрешите публикацию профиля. После успешного подтверждения уровня его можно найти со стороны работодателя и пройти сценарий приглашения выше. На сам тест отводится до 30 минут — этот вариант занимает больше времени, чем знакомство с готовыми примерами.</w:t>
       </w:r>
     </w:p>
     <w:p>
       <w:r>
-        <w:t>Запуск (../../README.md), основная документация PDF (FSP_MVP.pdf),</w:t>
+        <w:t>Если повторный тест недоступен, страница покажет причину и ближайшую дату. В общих демоаккаунтах это может быть следствием предыдущего прохождения. Если предложение или сообщение не появилось, обновите соответствующий раздел или страницу.</w:t>
+      </w:r>
+    </w:p>
+    <w:p>
+      <w:pPr>
+        <w:pStyle w:val="Heading2"/>
+      </w:pPr>
+      <w:r>
+        <w:t>Материалы для подробной оценки</w:t>
       </w:r>
     </w:p>
     <w:p>
       <w:r>
-        <w:t>дополнение этапа A PDF (STAGE_A.pdf), DOCX (STAGE_A.docx),</w:t>
+        <w:t>Презентация (../../demo/FSP_FINAL_2026-10-21.pdf) · Архитектура (ARCHITECTURE.md) · Требования и реализация (REQUIREMENTS_STATUS.md) · Результаты проверок (VALIDATION.md) · Исходный код и запуск (../../README.md)</w:t>
       </w:r>
     </w:p>
     <w:p>
       <w:r>
-        <w:t>актуальная презентация без редизайна (../../demo/FSP_FINAL_2026-10-21.pptx). Исходная копия FSP_NIKITA_SUBMISSION сохранена для истории.</w:t>
-      </w:r>
-    </w:p>
-    <w:p>
-      <w:r>
-        <w:t>Актуальная дополнительная документация: DOCX (FINAL_REPORT_2026-10-21.docx), PDF (FINAL_REPORT_2026-10-21.pdf), точечно обновлённые слайды (../../demo/FSP_FINAL_2026-10-21.pptx).</w:t>
+        <w:t>Технические проверки и ручной проход на компьютере и Android описаны в отчётах. Оценка качества подбора и грейдов выполнена на синтетических сценариях; независимый пилот с людьми не проводился.</w:t>
       </w:r>
     </w:p>
     <w:p>

</xml_diff>

<commit_message>
Keep candidate numbers visible and searchable after consent
</commit_message>
<xml_diff>
--- a/docs/delivery/STAGE_A.docx
+++ b/docs/delivery/STAGE_A.docx
@@ -370,7 +370,17 @@
     </w:p>
     <w:p>
       <w:r>
-        <w:t>Для проверки обеих сторон на текущем демостенде используйте кандидата №C7D0B82B — это профиль, который открывается кнопкой «Я кандидат». Если компания уже получила доступ к его контактам, вместо номера будет имя; его можно сверить в разделе «Мой профиль» окна кандидата.</w:t>
+        <w:t>Для проверки обеих сторон на текущем публичном демостенде используйте кандидата №C7D0B82B — это профиль, который открывается кнопкой «Я кандидат».</w:t>
+      </w:r>
+    </w:p>
+    <w:p>
+      <w:r>
+        <w:t>В окне работодателя откройте «Подбор кандидатов» → «Банк кандидатов», нажмите «Сбросить фильтры», введите C7D0B82B в поле «Номер кандидата» и нажмите «Применить фильтры». Можно сразу открыть этот профиль в банке кандидатов (https://85-137-26-131.sslip.io/search?candidate_code=C7D0B82B), войдя как работодатель. Номер остаётся видимым и после раскрытия имени и контактов.</w:t>
+      </w:r>
+    </w:p>
+    <w:p>
+      <w:r>
+        <w:t>На собственной установке номер будет другим: его можно скопировать в разделе «Мой профиль» окна кандидата. Если профиль скрыт самим кандидатом, он не появится в поиске: в его профиле должны быть включены публикация и согласие на обработку.</w:t>
       </w:r>
     </w:p>
     <w:p>

</xml_diff>

<commit_message>
Clarify candidate identifier and identity disclosure in jury guide
</commit_message>
<xml_diff>
--- a/docs/delivery/STAGE_A.docx
+++ b/docs/delivery/STAGE_A.docx
@@ -371,6 +371,11 @@
     <w:p>
       <w:r>
         <w:t>Для проверки обеих сторон на текущем публичном демостенде используйте кандидата №C7D0B82B — это профиль, который открывается кнопкой «Я кандидат».</w:t>
+      </w:r>
+    </w:p>
+    <w:p>
+      <w:r>
+        <w:t>C7D0B82B — идентификатор кандидата, а не его имя. До принятия приглашения настоящее имя и контакты кандидата скрыты от работодателя. Они открываются только той компании, чьё приглашение кандидат принял кнопкой «Принять и раскрыть контакты». Для остальных работодателей профиль остаётся анонимным.</w:t>
       </w:r>
     </w:p>
     <w:p>

</xml_diff>

<commit_message>
Make jury demos repeatable and restore saved sessions consistently
</commit_message>
<xml_diff>
--- a/docs/delivery/STAGE_A.docx
+++ b/docs/delivery/STAGE_A.docx
@@ -7,67 +7,52 @@
         <w:pStyle w:val="Heading1"/>
       </w:pPr>
       <w:r>
-        <w:t>Изменения после аудита и ручной приёмки</w:t>
+        <w:t>Демопроходы, история тестов и восстановление сессии</w:t>
       </w:r>
     </w:p>
     <w:p>
       <w:r>
-        <w:t>21 октября 2026, прикладной код c4bca3c. Текущий статус (CURRENT_STATUS_2026-10-21.md), проверки (STAGE_A_SMOKE.md), оставшиеся действия (REMAINING_AFTER_FINAL_AUDIT_2026-10-21.md). Push и отправка организаторам не выполнены.</w:t>
+        <w:t>21 октября 2026. Сценарий для жюри (FOR_JURY.md), отчёт проверок (evidence/repeatable_jury_2026-10-21.json).</w:t>
       </w:r>
     </w:p>
     <w:p>
       <w:r>
-        <w:t>- Q1: черновики сохраняются на сервере; при сбое остаются локально, уход требует подтверждения, восстановление сети отправляет очередь. Ошибка выделена контрастно.</w:t>
+        <w:t>- Вход по сохранённой сессии и обычный вход используют один переход в кабинет. При возврате во вкладку, восстановлении страницы и изменении входа в соседней вкладке приложение сверяет текущий аккаунт с сервером.</w:t>
       </w:r>
     </w:p>
     <w:p>
       <w:r>
-        <w:t>- Q2: банк 2.1.1 наследует явное half-up из 2.1.0; точка/запятая поддерживаются, старые оценки не пересчитывались. Исторические результаты имеют пояснение версии.</w:t>
+        <w:t>- Исправлен воспроизведённый сбой: прежний кабинет кандидата оставался открыт после смены cookie на работодателя, а история получала 403. При смене аккаунта прежние формы и данные очищаются. Запрос с ID другого отображаемого пользователя отклоняется до выполнения; запоздалый ответ старой сессии не применяется.</w:t>
       </w:r>
     </w:p>
     <w:p>
       <w:r>
-        <w:t>- Q3: количество пропусков и последствия показаны до сдачи; отмена сохраняет попытку, API требует явного подтверждения.</w:t>
+        <w:t>- История и доступность теста загружаются независимо. «Обновить историю» прерывает зависший запрос и запускает новый. Есть ограничение ожидания, повтор после сетевого сбоя и отдельное сообщение об ошибке вместо ложной пустой истории.</w:t>
       </w:r>
     </w:p>
     <w:p>
       <w:r>
-        <w:t>- Q4: тексты соответствуют подтверждению и публикации; отзыв закрывает доступ. Открытые приглашения обновляют контакты каждые 15 секунд и при фокусе окна.</w:t>
+        <w:t>- Три прежние попытки общего кандидата C7D0B82B сохранены. Они не удалялись и не заменялись новыми примерами.</w:t>
       </w:r>
     </w:p>
     <w:p>
       <w:r>
-        <w:t>- Q5: различимые анонимные обозначения, фильтры и сохранённые подборки, понятные вклады навыков/теста/ФСП. UI не меняет серверный порядок внутри категории.</w:t>
+        <w:t>- Новый демопроход создаёт отдельную пару кандидата и работодателя: Junior, опубликованный профиль, результаты 100% и 50%, пустые приглашения и задания. Повторное открытие той же ссылки сохраняет действия; новый проход начинает тот же сценарий с новыми идентификаторами.</w:t>
       </w:r>
     </w:p>
     <w:p>
       <w:r>
-        <w:t>- Q6: пауза/возобновление не создаёт ранний дубль; дата следующей выдачи сохраняется. Проверено управляемым временем и живым сценарием, не ожиданием реальной недели.</w:t>
+        <w:t>- Поиск по номеру, PDF, приглашения и сохранённые подборки соблюдают границы демопрохода. Чужие и реальные аккаунты не сбрасываются. Общие демоаккаунты остаются доступны отдельно.</w:t>
       </w:r>
     </w:p>
     <w:p>
       <w:r>
-        <w:t>- Q7: matching-1.2.0, веса 30/15/45/10 выбраны на dev. Holdout P@5 0,80 → 0,80: роста метрики не заявляем.</w:t>
+        <w:t>- Сценарий жюри и README обновлены: указаны независимые окна, номер своего кандидата, видимые результаты и повторный проход.</w:t>
       </w:r>
     </w:p>
     <w:p>
       <w:r>
-        <w:t>- После ручного прохода: повтор пароля, глаза, заметные ошибки, повторное письмо и восстановление доступа с аннулированием прежних сессий. Подсказка содержит только длину пароля.</w:t>
-      </w:r>
-    </w:p>
-    <w:p>
-      <w:r>
-        <w:t>- Зарплата и оценка теперь позволяют стереть ноль; исправлены отступы кнопок, аватара и слова в мобильном заголовке.</w:t>
-      </w:r>
-    </w:p>
-    <w:p>
-      <w:r>
-        <w:t>- Дополнительный аудит: пакетное чтение вместо N+1, защита конкурентного рендера PDF, сохранение остальных результатов при скрытом профиле в старом снимке.</w:t>
-      </w:r>
-    </w:p>
-    <w:p>
-      <w:r>
-        <w:t>Последние результаты: 119 серверных тестов, 8 проверок регистрации/восстановления, 24 группы живого HTTPS smoke — PASS. Ручная проверка с ПК/Android выполнена с сопровождением. Реальная SMTP-доставка проверена; официальный ФСП и независимый пилот — нет. Слайды обновлены точечно отдельной копией, исходная презентация сохранена.</w:t>
+        <w:t>132 серверных теста и 11 групп браузерной навигации прошли. Два полных прохода на отдельной базе прошли с одинаковыми начальными состояниями. Дополнительно проверены сохранённые cookies, смена ролей и аккаунтов между вкладками, восстановление страницы, истечение сессии, задержки и ошибки загрузки. Результаты проверки опубликованной версии записаны в отчёте по ссылке выше. SMTP и независимый пилот в этом прогоне не проверялись.</w:t>
       </w:r>
     </w:p>
     <w:p>
@@ -109,12 +94,27 @@
     </w:p>
     <w:p>
       <w:r>
-        <w:t>На странице входа под формой находятся кнопки «Я кандидат» и «Я работодатель». Нажмите первую в одном окне, вторую — в другом. На телефоне разделы открываются кнопкой «Все разделы».</w:t>
+        <w:t>1. На странице входа под формой нажмите «Начать новый демопроход». Появится ссылка на вашу пару демонстрационных аккаунтов.</w:t>
       </w:r>
     </w:p>
     <w:p>
       <w:r>
-        <w:t>Демоаккаунты общие: в них могут быть результаты и приглашения предыдущих посетителей. Используйте вымышленные данные. Если хотите пройти всё с чистого листа, инструкция есть в конце этой страницы.</w:t>
+        <w:t>2. Скопируйте эту ссылку и откройте её во втором независимом окне.</w:t>
+      </w:r>
+    </w:p>
+    <w:p>
+      <w:r>
+        <w:t>3. В первом окне нажмите «Я кандидат», во втором — «Я работодатель». На телефоне разделы открываются кнопкой «Все разделы».</w:t>
+      </w:r>
+    </w:p>
+    <w:p>
+      <w:r>
+        <w:t>В новом проходе уже есть опубликованный кандидат Junior с двумя результатами тестирования — 100% и 50%. Приглашения, диалоги и задания пока пусты. Используйте только вымышленные данные. Одна и та же ссылка возвращает к этому проходу и сохраняет его действия; новый проход создаёт отдельную пару аккаунтов и не меняет предыдущие.</w:t>
+      </w:r>
+    </w:p>
+    <w:p>
+      <w:r>
+        <w:t>Если нажать кнопки ролей без создания нового прохода, откроются общие демоаккаунты с действиями прошлых посетителей. Для последовательной проверки ниже используйте именно новый демопроход.</w:t>
       </w:r>
     </w:p>
     <w:p>
@@ -132,7 +132,12 @@
     </w:p>
     <w:p>
       <w:r>
-        <w:t>Перейдите в «Подтверждение навыков» и откройте доступный результат в истории тестирования. Посмотрите задания, ответы, итоговую оценку и объяснения. В текущем тесте 8 заданий на 30 минут; для подтверждения уровня нужны минимум 6 правильных ответов, из них минимум 3 по основному навыку — Python или SQL.</w:t>
+        <w:t>Перейдите в «Подтверждение навыков». В истории откройте результат 100%: видны 8 заданий, правильные ответы и объяснения. Затем откройте результат 50%: часть ответов неверна, но ранее подтверждённый Junior сохранён. Если история не загрузилась, нажмите «Обновить историю».</w:t>
+      </w:r>
+    </w:p>
+    <w:p>
+      <w:r>
+        <w:t>В текущем тесте 8 заданий на 30 минут; для подтверждения уровня нужны минимум 6 правильных ответов, из них минимум 3 по основному навыку — Python или SQL. Для этого демонстрационного прохода начинать новый тест не нужно.</w:t>
       </w:r>
     </w:p>
     <w:p>
@@ -370,27 +375,27 @@
     </w:p>
     <w:p>
       <w:r>
-        <w:t>Для проверки обеих сторон на текущем публичном демостенде используйте кандидата №C7D0B82B — это профиль, который открывается кнопкой «Я кандидат».</w:t>
+        <w:t>Используйте номер кандидата вашего демопрохода: он указан в строке «Отдельный демопроход · кандидат №…» над содержимым страницы в обоих окнах, а также в разделе «Мой профиль» кандидата. В каждом новом проходе номер другой.</w:t>
       </w:r>
     </w:p>
     <w:p>
       <w:r>
-        <w:t>C7D0B82B — идентификатор кандидата, а не его имя. До принятия приглашения настоящее имя и контакты кандидата скрыты от работодателя. Они открываются только той компании, чьё приглашение кандидат принял кнопкой «Принять и раскрыть контакты». Для остальных работодателей профиль остаётся анонимным.</w:t>
+        <w:t>Номер — идентификатор кандидата, а не его имя. До принятия приглашения настоящее имя и контакты кандидата скрыты от работодателя. Они открываются только той компании, чьё приглашение кандидат принял кнопкой «Принять и раскрыть контакты». Для остальных работодателей профиль остаётся анонимным.</w:t>
       </w:r>
     </w:p>
     <w:p>
       <w:r>
-        <w:t>В окне работодателя откройте «Подбор кандидатов» → «Банк кандидатов», нажмите «Сбросить фильтры», введите C7D0B82B в поле «Номер кандидата» и нажмите «Применить фильтры». Можно сразу открыть этот профиль в банке кандидатов (https://85-137-26-131.sslip.io/search?candidate_code=C7D0B82B), войдя как работодатель. Номер остаётся видимым и после раскрытия имени и контактов.</w:t>
+        <w:t>В окне работодателя раскройте строку «Отдельный демопроход · кандидат №…» и нажмите «Найти кандидата этого прохода». Либо откройте «Подбор кандидатов» → «Банк кандидатов», нажмите «Сбросить фильтры», введите свой номер в поле «Номер кандидата» и нажмите «Применить фильтры». Номер остаётся видимым и после раскрытия имени и контактов.</w:t>
       </w:r>
     </w:p>
     <w:p>
       <w:r>
-        <w:t>На собственной установке номер будет другим: его можно скопировать в разделе «Мой профиль» окна кандидата. Если профиль скрыт самим кандидатом, он не появится в поиске: в его профиле должны быть включены публикация и согласие на обработку.</w:t>
+        <w:t>Скачайте PDF кнопкой со значком загрузки в карточке: до согласия в нём нет имени и контактов. После принятия приглашения скачайте PDF снова — данные станут доступны этой компании.</w:t>
       </w:r>
     </w:p>
     <w:p>
       <w:r>
-        <w:t>1. В карточке нажмите «Пригласить». Например, укажите «Разработка API на Python» и зарплату 100 000–150 000 ₽ в месяц. Отправьте приглашение.</w:t>
+        <w:t>1. В карточке нажмите «Пригласить». Например, укажите «Разработка API на Python» и зарплату 100 000–150 000 ₽ в месяц. Отправьте приглашение и закройте подтверждение кнопкой «Готово».</w:t>
       </w:r>
     </w:p>
     <w:p>
@@ -415,7 +420,7 @@
     </w:p>
     <w:p>
       <w:r>
-        <w:t>Если приглашение уже ожидает ответа, продолжите с него. Если оно уже принято, можно сразу посмотреть открытые контакты и диалог; это результат предыдущего посетителя, а не новое согласие с вашей стороны.</w:t>
+        <w:t>Если вы вернулись по ссылке к уже начатому проходу, продолжите с существующего приглашения. Для повторения с исходного состояния создайте новый проход, как описано ниже.</w:t>
       </w:r>
     </w:p>
     <w:p>
@@ -428,22 +433,50 @@
         <w:pStyle w:val="Heading2"/>
       </w:pPr>
       <w:r>
-        <w:t>Что ещё можно посмотреть</w:t>
+        <w:t>4. Проверьте дополнительные возможности</w:t>
       </w:r>
     </w:p>
     <w:p>
       <w:r>
-        <w:t>- «Задания от компаний». После принятия приглашения работодатель может предложить короткое задание с критериями и сроком. Кандидат отдельно соглашается на получение заданий. Оценка работодателя не меняет подтверждённый профессиональный уровень.</w:t>
+        <w:t>Задание от компании. У работодателя откройте «Задания от компаний», выберите кандидата своего прохода. Укажите название «Проверка обработки ошибок API», вопрос «Как повторять запрос при временной ошибке API и предотвращать дублирование операции?» и критерии «Ограничение повторов, задержка между ними, защита от дублей». Нажмите «Предложить план кандидату».</w:t>
       </w:r>
     </w:p>
     <w:p>
       <w:r>
-        <w:t>- «Достижения ФСП». Дополнительные достижения учитываются при подборе, но не повышают уровень. Участие в соревнованиях не требуется для использования платформы. На стенде показана демонстрационная интеграция, без подключения к официальному реестру.</w:t>
+        <w:t>В том же разделе у кандидата нажмите «Согласиться и включить выдачу», отправьте ответ: «Ограничиваю число повторов, увеличиваю задержку, использую ключ идемпотентности». У работодателя нажмите «Обновить задания», поставьте 85 и добавьте обоснование, затем сохраните оценку. После обновления кандидат видит 85/100, а его уровень остаётся Junior. Приостановите и снова включите выдачу: уже выполненное задание не должно выдаваться повторно немедленно.</w:t>
       </w:r>
     </w:p>
     <w:p>
       <w:r>
-        <w:t>- «Мой профиль». Кандидат управляет публикацией. Её отключение закрывает доступ к профилю, контактам и диалогу; повторная публикация не возвращает старые разрешения автоматически. Проверяйте этот сценарий на собственном тестовом аккаунте, чтобы не прерывать работу других посетителей общего демо.</w:t>
+        <w:t>Достижения ФСП. У кандидата откройте «Достижения ФСП» и нажмите «Связать демонстрационный ФСП ID». Junior сохраняется. У работодателя заново сформируйте подборку с параметрами из шага 2 и без требования HTTP / API: у вашего кандидата общий балл увеличится с 90 до 96 за счёт ФСП. Это демонстрационная интеграция, без подключения к официальному реестру.</w:t>
+      </w:r>
+    </w:p>
+    <w:p>
+      <w:r>
+        <w:t>Управление доступом. В «Моём профиле» кандидата отключите публикацию и сохраните. После обновления окна работодателя профиль исчезает из поиска, PDF недоступен, диалог закрыт. Включите публикацию обратно: старое согласие не восстанавливается. Для нового доступа отправьте ещё одно приглашение и примите его в окне кандидата. Эти действия в отдельном демопроходе не затрагивают других посетителей.</w:t>
+      </w:r>
+    </w:p>
+    <w:p>
+      <w:pPr>
+        <w:pStyle w:val="Heading2"/>
+      </w:pPr>
+      <w:r>
+        <w:t>Повторите проверку с начала</w:t>
+      </w:r>
+    </w:p>
+    <w:p>
+      <w:r>
+        <w:t>Выйдите из кабинетов. В первом окне нажмите «Начать ещё один демопроход» (или «Начать новый демопроход», если это новый браузер), скопируйте новую ссылку во второе окно и снова выберите роли. Не создавайте два отдельных прохода для двух ролей.</w:t>
+      </w:r>
+    </w:p>
+    <w:p>
+      <w:r>
+        <w:t>Начальные состояния повторяются: Junior, результаты 100% и 50%, профиль опубликован, контакты скрыты, приглашений, диалогов, заданий и достижений ФСП нет. Идентификаторы, даты и числовые варианты заданий могут отличаться; правила, оценки и последовательность действий одинаковы. Старую ссылку можно сохранить для возврата к предыдущему проходу.</w:t>
+      </w:r>
+    </w:p>
+    <w:p>
+      <w:r>
+        <w:t>Общий кандидат C7D0B82B на публичном стенде сохранён отдельно. Он доступен через обычные кнопки ролей без нового прохода; его история и действия прошлых посетителей не сбрасываются.</w:t>
       </w:r>
     </w:p>
     <w:p>
@@ -493,7 +526,82 @@
         <w:pageBreakBefore/>
       </w:pPr>
       <w:r>
-        <w:t>Последние проверки этапа A</w:t>
+        <w:t>Последние проверки: повторяемый сценарий и сессии</w:t>
+      </w:r>
+    </w:p>
+    <w:p>
+      <w:r>
+        <w:t>21 октября 2026. Машиночитаемый отчёт (evidence/repeatable_jury_2026-10-21.json) содержит результаты последнего прогона и его границы.</w:t>
+      </w:r>
+    </w:p>
+    <w:p>
+      <w:r>
+        <w:t>- Сервер: 132 PASS, одно предупреждение устаревания в тестовой зависимости.</w:t>
+      </w:r>
+    </w:p>
+    <w:p>
+      <w:r>
+        <w:t>- Навигация: 11 групп PASS — переходы, Back/Forward, прямые ссылки, сохранение черновиков, выход и мобильное меню.</w:t>
+      </w:r>
+    </w:p>
+    <w:p>
+      <w:r>
+        <w:t>- Полный сценарий жюри: два прохода на отдельной базе, одинаковые начальные состояния. Проверены история и объяснения, подбор и номер кандидата, согласие и PDF, чат, задание с оценкой 85/100, ФСП, скрытие профиля и повторное согласие.</w:t>
+      </w:r>
+    </w:p>
+    <w:p>
+      <w:r>
+        <w:t>- Сессии: 7 групп PASS на отдельной базе — сохранённый вход без повторной авторизации, независимая загрузка истории, ручной перезапуск зависшего запроса, тайм-аут и сетевые ошибки, смена роли и аккаунта во вкладках, восстановление страницы, истечение сессии.</w:t>
+      </w:r>
+    </w:p>
+    <w:p>
+      <w:r>
+        <w:t>- Итоговая проверка публичной версии и общего кандидата C7D0B82B — в отчёте. Общая история не пересоздавалась.</w:t>
+      </w:r>
+    </w:p>
+    <w:p>
+      <w:r>
+        <w:t>Воспроизведение на отдельной базе после npm run build --prefix apps/web:</w:t>
+      </w:r>
+    </w:p>
+    <w:p>
+      <w:r>
+        <w:t>bash</w:t>
+      </w:r>
+    </w:p>
+    <w:p>
+      <w:r>
+        <w:t>COOKIE_SECURE=false .venv/bin/python scripts/run_local.py .venv/bin/pytest -q tests</w:t>
+      </w:r>
+    </w:p>
+    <w:p>
+      <w:r>
+        <w:t>.venv/bin/python scripts/run_local.py .venv/bin/python tests/browser_navigation.py</w:t>
+      </w:r>
+    </w:p>
+    <w:p>
+      <w:r>
+        <w:t>.venv/bin/python scripts/run_local.py .venv/bin/python tests/run_jury_isolated.py</w:t>
+      </w:r>
+    </w:p>
+    <w:p/>
+    <w:p>
+      <w:r>
+        <w:t>Второй и третий сценарии создают и удаляют только собственные временные базы. Проверка публичного демостенда выполняется tests/browser_jury.py --base-url URL --runs 2 и tests/browser_sessions.py --base-url URL; они создают новые вымышленные демопроходы и сохраняют результаты в audit/current/. Письма не отправляются; чужие профили и общий демопроход не сбрасываются.</w:t>
+      </w:r>
+    </w:p>
+    <w:p>
+      <w:r>
+        <w:t>---</w:t>
+      </w:r>
+    </w:p>
+    <w:p>
+      <w:pPr>
+        <w:pStyle w:val="Heading1"/>
+        <w:pageBreakBefore/>
+      </w:pPr>
+      <w:r>
+        <w:t>Исторический срез ручной приёмки</w:t>
       </w:r>
     </w:p>
     <w:p>

</xml_diff>

<commit_message>
Restore simple demo login and verify repeatable two-window jury checks
</commit_message>
<xml_diff>
--- a/docs/delivery/STAGE_A.docx
+++ b/docs/delivery/STAGE_A.docx
@@ -7,52 +7,42 @@
         <w:pStyle w:val="Heading1"/>
       </w:pPr>
       <w:r>
-        <w:t>Демопроходы, история тестов и восстановление сессии</w:t>
+        <w:t>Повторная проверка в двух независимых окнах</w:t>
       </w:r>
     </w:p>
     <w:p>
       <w:r>
-        <w:t>21 октября 2026. Сценарий для жюри (FOR_JURY.md), отчёт проверок (evidence/repeatable_jury_2026-10-21.json).</w:t>
+        <w:t>21 октября 2026. Сценарий (FOR_JURY.md), протокол (STAGE_A_SMOKE.md).</w:t>
       </w:r>
     </w:p>
     <w:p>
       <w:r>
-        <w:t>- Вход по сохранённой сессии и обычный вход используют один переход в кабинет. При возврате во вкладку, восстановлении страницы и изменении входа в соседней вкладке приложение сверяет текущий аккаунт с сервером.</w:t>
+        <w:t>- Возвращён простой вход «Я кандидат» / «Я работодатель» в существующие общие аккаунты. Интерфейс создания демопроходов и переключатель ролей удалены. Для одновременной работы нужны обычное окно и инкогнито либо разные браузеры.</w:t>
       </w:r>
     </w:p>
     <w:p>
       <w:r>
-        <w:t>- Исправлен воспроизведённый сбой: прежний кабинет кандидата оставался открыт после смены cookie на работодателя, а история получала 403. При смене аккаунта прежние формы и данные очищаются. Запрос с ID другого отображаемого пользователя отклоняется до выполнения; запоздалый ответ старой сессии не применяется.</w:t>
+        <w:t>- Ошибку загрузки компании можно исправить кнопкой повторной загрузки прямо в приглашении, сохранив текст и зарплату. Зависший запрос отменяется; отправка доступна после загрузки компании.</w:t>
       </w:r>
     </w:p>
     <w:p>
       <w:r>
-        <w:t>- История и доступность теста загружаются независимо. «Обновить историю» прерывает зависший запрос и запускает новый. Есть ограничение ожидания, повтор после сетевого сбоя и отдельное сообщение об ошибке вместо ложной пустой истории.</w:t>
+        <w:t>- «Обновить задания» обновляет и задания, и список получателей после принятия приглашения. После ошибки первой загрузки кнопка остаётся доступна. Обновление также выполняется при возврате в окно.</w:t>
       </w:r>
     </w:p>
     <w:p>
       <w:r>
-        <w:t>- Три прежние попытки общего кандидата C7D0B82B сохранены. Они не удалялись и не заменялись новыми примерами.</w:t>
+        <w:t>- Восстановление сессии, защита от смешения аккаунтов, независимая загрузка истории и доступности теста сохранены. Существующие попытки не сбрасываются.</w:t>
       </w:r>
     </w:p>
     <w:p>
       <w:r>
-        <w:t>- Новый демопроход создаёт отдельную пару кандидата и работодателя: Junior, опубликованный профиль, результаты 100% и 50%, пустые приглашения и задания. Повторное открытие той же ссылки сохраняет действия; новый проход начинает тот же сценарий с новыми идентификаторами.</w:t>
+        <w:t>- Сценарий для жюри описывает продолжение по текущему статусу и повтор на тех же аккаунтах с новыми текстами предложений. Прежние сообщения и результаты остаются. Несохранённый текст формы и истекающий срок теста отдельно оговорены.</w:t>
       </w:r>
     </w:p>
     <w:p>
       <w:r>
-        <w:t>- Поиск по номеру, PDF, приглашения и сохранённые подборки соблюдают границы демопрохода. Чужие и реальные аккаунты не сбрасываются. Общие демоаккаунты остаются доступны отдельно.</w:t>
-      </w:r>
-    </w:p>
-    <w:p>
-      <w:r>
-        <w:t>- Сценарий жюри и README обновлены: указаны независимые окна, номер своего кандидата, видимые результаты и повторный проход.</w:t>
-      </w:r>
-    </w:p>
-    <w:p>
-      <w:r>
-        <w:t>132 серверных теста и 11 групп браузерной навигации прошли. Два полных прохода на отдельной базе прошли с одинаковыми начальными состояниями. Дополнительно проверены сохранённые cookies, смена ролей и аккаунтов между вкладками, восстановление страницы, истечение сессии, задержки и ошибки загрузки. Результаты проверки опубликованной версии записаны в отчёте по ссылке выше. SMTP и независимый пилот в этом прогоне не проверялись.</w:t>
+        <w:t>Результаты исполненных проверок и границы приведены в протоколе (STAGE_A_SMOKE.md). Следующие разделы — история прежних версий; инструкции по отдельным демопроходам из неё больше не относятся к интерфейсу.</w:t>
       </w:r>
     </w:p>
     <w:p>
@@ -66,17 +56,17 @@
     </w:p>
     <w:p>
       <w:r>
-        <w:t>Открыть демонстрационный сайт (https://85-137-26-131.sslip.io/)</w:t>
+        <w:t>Открыть сайт (https://85-137-26-131.sslip.io/)</w:t>
       </w:r>
     </w:p>
     <w:p>
       <w:r>
-        <w:t>Платформа помогает работодателю найти специалиста по подтверждённым навыкам. Кандидат проходит тест и выбирает, кому открыть контакты. Работодатель видит основания подбора и отправляет личное предложение с зарплатой.</w:t>
+        <w:t>Кандидат подтверждает навыки тестом. Работодатель подбирает специалиста по этим результатам и отправляет предложение с зарплатой. Кандидат решает, кому открыть имя и контакты.</w:t>
       </w:r>
     </w:p>
     <w:p>
       <w:r>
-        <w:t>На знакомство с готовыми примерами достаточно около 10–15 минут. Регистрация и полное прохождение теста для этого не нужны.</w:t>
+        <w:t>Основной сценарий занимает около 10–15 минут. Регистрироваться и заново проходить тест не нужно: доступны готовые демонстрационные аккаунты.</w:t>
       </w:r>
     </w:p>
     <w:p>
@@ -84,37 +74,32 @@
         <w:pStyle w:val="Heading2"/>
       </w:pPr>
       <w:r>
-        <w:t>Перед началом</w:t>
+        <w:t>Подготовьте два окна</w:t>
       </w:r>
     </w:p>
     <w:p>
       <w:r>
-        <w:t>Откройте сайт в двух независимых окнах: обычном и инкогнито либо в двух разных браузерах. Так вы сможете одновременно посмотреть обе роли. Две обычные вкладки одного браузера используют общий вход.</w:t>
+        <w:t>1. В обычном окне на странице входа нажмите «Я кандидат».</w:t>
       </w:r>
     </w:p>
     <w:p>
       <w:r>
-        <w:t>1. На странице входа под формой нажмите «Начать новый демопроход». Появится ссылка на вашу пару демонстрационных аккаунтов.</w:t>
+        <w:t>2. Откройте этот же сайт в инкогнито или другом браузере и нажмите «Я работодатель».</w:t>
       </w:r>
     </w:p>
     <w:p>
       <w:r>
-        <w:t>2. Скопируйте эту ссылку и откройте её во втором независимом окне.</w:t>
+        <w:t>Два обычных окна одного браузера используют общий вход. Два окна инкогнито тоже делят вход между собой. Поэтому используйте именно обычное окно + инкогнито либо два разных браузера. Далее переходите между этими окнами; выходить из аккаунтов на каждом шаге не нужно.</w:t>
       </w:r>
     </w:p>
     <w:p>
       <w:r>
-        <w:t>3. В первом окне нажмите «Я кандидат», во втором — «Я работодатель». На телефоне разделы открываются кнопкой «Все разделы».</w:t>
+        <w:t>Если сайт сразу открыл сохранённый кабинет, проверьте роль слева. При необходимости нажмите «Выйти» и выберите нужную кнопку на странице входа. На телефоне разделы открываются кнопкой «Все разделы».</w:t>
       </w:r>
     </w:p>
     <w:p>
       <w:r>
-        <w:t>В новом проходе уже есть опубликованный кандидат Junior с двумя результатами тестирования — 100% и 50%. Приглашения, диалоги и задания пока пусты. Используйте только вымышленные данные. Одна и та же ссылка возвращает к этому проходу и сохраняет его действия; новый проход создаёт отдельную пару аккаунтов и не меняет предыдущие.</w:t>
-      </w:r>
-    </w:p>
-    <w:p>
-      <w:r>
-        <w:t>Если нажать кнопки ролей без создания нового прохода, откроются общие демоаккаунты с действиями прошлых посетителей. Для последовательной проверки ниже используйте именно новый демопроход.</w:t>
+        <w:t>Аккаунты общие: предыдущие приглашения, сообщения и результаты могут уже присутствовать. Они не сбрасываются при входе. Используйте только вымышленные данные.</w:t>
       </w:r>
     </w:p>
     <w:p>
@@ -122,27 +107,27 @@
         <w:pStyle w:val="Heading2"/>
       </w:pPr>
       <w:r>
-        <w:t>1. Посмотрите, что видит кандидат</w:t>
+        <w:t>1. Посмотрите профиль и результаты кандидата</w:t>
       </w:r>
     </w:p>
     <w:p>
       <w:r>
-        <w:t>В окне кандидата откройте «Обзор». Здесь показаны специализация, подтверждённый уровень и видимость профиля для работодателей.</w:t>
+        <w:t>В окне кандидата откройте «Мой профиль». Запишите номер кандидата. На публичном стенде у кандидата из кнопки «Я кандидат» это C7D0B82B. На собственной установке номер может отличаться.</w:t>
       </w:r>
     </w:p>
     <w:p>
       <w:r>
-        <w:t>Перейдите в «Подтверждение навыков». В истории откройте результат 100%: видны 8 заданий, правильные ответы и объяснения. Затем откройте результат 50%: часть ответов неверна, но ранее подтверждённый Junior сохранён. Если история не загрузилась, нажмите «Обновить историю».</w:t>
+        <w:t>Для поиска работодателем должны быть включены «Согласен на обработку данных для работы профиля» и «Публиковать профиль в банке кандидатов». Если профиль скрыли во время предыдущей проверки, включите эти пункты и нажмите «Сохранить профиль».</w:t>
       </w:r>
     </w:p>
     <w:p>
       <w:r>
-        <w:t>В текущем тесте 8 заданий на 30 минут; для подтверждения уровня нужны минимум 6 правильных ответов, из них минимум 3 по основному навыку — Python или SQL. Для этого демонстрационного прохода начинать новый тест не нужно.</w:t>
+        <w:t>Откройте «Подтверждение навыков». В истории нажмите «Посмотреть» у завершённой попытки: видны задания, ответы, оценка и объяснения. Результаты сохраняются после обновления страницы и повторного входа. При ошибке загрузки используйте «Обновить историю».</w:t>
       </w:r>
     </w:p>
     <w:p>
       <w:r>
-        <w:t>Что показывает этот шаг: уровень опирается на результат теста. Неудачная попытка не понижает уже подтверждённый уровень. Примеры результатов в демопрофилях созданы для демонстрации.</w:t>
+        <w:t>Начинать новый тест для этого сценария не требуется. Для самостоятельного тестирования страница показывает правила, доступные уровни и ограничения пересдачи. Неудачная попытка не понижает ранее подтверждённый уровень.</w:t>
       </w:r>
     </w:p>
     <w:p>
@@ -150,12 +135,12 @@
         <w:pStyle w:val="Heading2"/>
       </w:pPr>
       <w:r>
-        <w:t>2. Подберите специалиста от имени компании</w:t>
+        <w:t>2. Подберите специалиста</w:t>
       </w:r>
     </w:p>
     <w:p>
       <w:r>
-        <w:t>В окне работодателя откройте «Подбор кандидатов» → «По потребности» и задайте:</w:t>
+        <w:t>В окне работодателя откройте «Подбор кандидатов» → «По потребности»:</w:t>
       </w:r>
     </w:p>
     <w:tbl>
@@ -189,7 +174,7 @@
           </w:tcPr>
           <w:p>
             <w:r>
-              <w:t>Значение для примера</w:t>
+              <w:t>Значение</w:t>
             </w:r>
           </w:p>
         </w:tc>
@@ -347,17 +332,17 @@
     </w:tbl>
     <w:p>
       <w:r>
-        <w:t>Нажмите «Сформировать подборку». В карточке любого кандидата прочитайте «Почему в подборке» и раскройте «Результаты и источники». Здесь видны подтверждённые навыки, результаты тестирования и составляющие общего балла.</w:t>
+        <w:t>Нажмите «Сформировать подборку». Прочитайте «Почему в подборке», раскройте «Результаты и источники». В карточке видны основания соответствия и составляющие балла.</w:t>
       </w:r>
     </w:p>
     <w:p>
       <w:r>
-        <w:t>Теперь сделайте HTTP / API обязательным и снова сформируйте подборку. У кандидата без подтверждения этого навыка появится отметка «Не проверено», а при неполном соответствии обязательным требованиям — пояснение об этом.</w:t>
+        <w:t>Для сравнения сделайте HTTP / API обязательным и сформируйте подборку снова. У кандидата без доказательства этого навыка появится «Не проверено» и пояснение о неполном соответствии. Верните HTTP / API в «Не учитывать» и снова сформируйте подборку.</w:t>
       </w:r>
     </w:p>
     <w:p>
       <w:r>
-        <w:t>Что показывает этот шаг: система объясняет соответствие запросу и явно обозначает недостающие доказательства. Общий балл помогает сравнивать кандидатов внутри одной категории; он не означает вероятность найма.</w:t>
+        <w:t>Баллы сравниваются внутри категории; это не вероятность найма. Редактирование условий само по себе не меняет сохранённую подборку — нужно нажать кнопку формирования.</w:t>
       </w:r>
     </w:p>
     <w:p>
@@ -365,67 +350,47 @@
         <w:pStyle w:val="Heading2"/>
       </w:pPr>
       <w:r>
-        <w:t>3. Отправьте предложение и посмотрите ответ кандидата</w:t>
+        <w:t>3. Отправьте предложение кандидату</w:t>
       </w:r>
     </w:p>
     <w:p>
       <w:r>
-        <w:t>Верните HTTP / API в «Не учитывать» и сформируйте подборку заново.</w:t>
+        <w:t>Откройте «Банк кандидатов» → «Сбросить фильтры», введите C7D0B82B в поле «Номер кандидата», нажмите «Применить фильтры». При собственной установке используйте номер из шага 1.</w:t>
       </w:r>
     </w:p>
     <w:p>
       <w:r>
-        <w:t>Используйте номер кандидата вашего демопрохода: он указан в строке «Отдельный демопроход · кандидат №…» над содержимым страницы в обоих окнах, а также в разделе «Мой профиль» кандидата. В каждом новом проходе номер другой.</w:t>
+        <w:t>Это идентификатор, а не имя. До принятия приглашения имя и контакты скрыты от работодателя. После согласия они доступны только пригласившей компании. Номер остаётся в карточке и после раскрытия имени, поэтому искать нужно по номеру. Если предыдущая проверка уже открыла этой компании контакты, они могут быть видны сразу.</w:t>
       </w:r>
     </w:p>
     <w:p>
       <w:r>
-        <w:t>Номер — идентификатор кандидата, а не его имя. До принятия приглашения настоящее имя и контакты кандидата скрыты от работодателя. Они открываются только той компании, чьё приглашение кандидат принял кнопкой «Принять и раскрыть контакты». Для остальных работодателей профиль остаётся анонимным.</w:t>
+        <w:t>1. Нажмите «Пригласить». В предложении напишите, например, «Проверка жюри — 1. Разработка API на Python». Укажите зарплату от 100 000 до 150 000 ₽ и отправьте приглашение.</w:t>
       </w:r>
     </w:p>
     <w:p>
       <w:r>
-        <w:t>В окне работодателя раскройте строку «Отдельный демопроход · кандидат №…» и нажмите «Найти кандидата этого прохода». Либо откройте «Подбор кандидатов» → «Банк кандидатов», нажмите «Сбросить фильтры», введите свой номер в поле «Номер кандидата» и нажмите «Применить фильтры». Номер остаётся видимым и после раскрытия имени и контактов.</w:t>
+        <w:t>2. В окне кандидата откройте «Приглашения». Найдите именно предложение с вашим текстом, прочитайте условия и нажмите «Принять и раскрыть контакты».</w:t>
       </w:r>
     </w:p>
     <w:p>
       <w:r>
-        <w:t>Скачайте PDF кнопкой со значком загрузки в карточке: до согласия в нём нет имени и контактов. После принятия приглашения скачайте PDF снова — данные станут доступны этой компании.</w:t>
+        <w:t>3. В окне работодателя откройте «Приглашения». Найдите это же предложение: статус «Принято», контакты доступны.</w:t>
       </w:r>
     </w:p>
     <w:p>
       <w:r>
-        <w:t>1. В карточке нажмите «Пригласить». Например, укажите «Разработка API на Python» и зарплату 100 000–150 000 ₽ в месяц. Отправьте приглашение и закройте подтверждение кнопкой «Готово».</w:t>
+        <w:t>4. Нажмите «Открыть диалог», отправьте сообщение. Откройте диалог этого предложения в окне кандидата и ответьте. Кнопка «Обновить» загружает новые сообщения.</w:t>
       </w:r>
     </w:p>
     <w:p>
       <w:r>
-        <w:t>2. В окне кандидата откройте «Приглашения». Найдите предложение, прочитайте задачи, зарплату и сведения о компании.</w:t>
+        <w:t>5. В карточке кандидата скачайте PDF значком загрузки. При действующем согласии в нём есть контакты. Без согласия PDF содержит обезличенный профиль.</w:t>
       </w:r>
     </w:p>
     <w:p>
       <w:r>
-        <w:t>3. Нажмите «Принять и раскрыть контакты».</w:t>
-      </w:r>
-    </w:p>
-    <w:p>
-      <w:r>
-        <w:t>4. Вернитесь в окно работодателя, откройте «Приглашения» и обновите страницу. У принятого предложения доступны контакты и кнопка «Открыть диалог».</w:t>
-      </w:r>
-    </w:p>
-    <w:p>
-      <w:r>
-        <w:t>5. При желании обменяйтесь короткими тестовыми сообщениями через два окна.</w:t>
-      </w:r>
-    </w:p>
-    <w:p>
-      <w:r>
-        <w:t>Если вы вернулись по ссылке к уже начатому проходу, продолжите с существующего приглашения. Для повторения с исходного состояния создайте новый проход, как описано ниже.</w:t>
-      </w:r>
-    </w:p>
-    <w:p>
-      <w:r>
-        <w:t>Что показывает этот шаг: кандидат видит условия до начала общения. Контакты открываются пригласившей компании после принятия предложения. В карточке кандидата также можно скачать PDF-профиль; его содержимое зависит от предоставленного компании доступа.</w:t>
+        <w:t>Новые предложения расположены выше старых. Если приглашение уже принято, продолжайте с диалога. Если отклонено, создайте другое предложение. При временной ошибке загрузки компании нажмите «Загрузить компанию повторно» в открытом окне: введённое предложение и зарплата сохраняются.</w:t>
       </w:r>
     </w:p>
     <w:p>
@@ -433,27 +398,42 @@
         <w:pStyle w:val="Heading2"/>
       </w:pPr>
       <w:r>
-        <w:t>4. Проверьте дополнительные возможности</w:t>
+        <w:t>4. Дополнительные проверки</w:t>
       </w:r>
     </w:p>
     <w:p>
       <w:r>
-        <w:t>Задание от компании. У работодателя откройте «Задания от компаний», выберите кандидата своего прохода. Укажите название «Проверка обработки ошибок API», вопрос «Как повторять запрос при временной ошибке API и предотвращать дублирование операции?» и критерии «Ограничение повторов, задержка между ними, защита от дублей». Нажмите «Предложить план кандидату».</w:t>
+        <w:t>Задание от компании. У работодателя откройте «Задания от компаний». После принятия приглашения кандидат появится в получателях; при необходимости нажмите «Обновить задания». Создайте план с узнаваемым названием, например «Ошибки API — проверка 1»:</w:t>
       </w:r>
     </w:p>
     <w:p>
       <w:r>
-        <w:t>В том же разделе у кандидата нажмите «Согласиться и включить выдачу», отправьте ответ: «Ограничиваю число повторов, увеличиваю задержку, использую ключ идемпотентности». У работодателя нажмите «Обновить задания», поставьте 85 и добавьте обоснование, затем сохраните оценку. После обновления кандидат видит 85/100, а его уровень остаётся Junior. Приостановите и снова включите выдачу: уже выполненное задание не должно выдаваться повторно немедленно.</w:t>
+        <w:t>- Задача: «Как повторять запрос при временной ошибке API и предотвращать дублирование операции?»</w:t>
       </w:r>
     </w:p>
     <w:p>
       <w:r>
-        <w:t>Достижения ФСП. У кандидата откройте «Достижения ФСП» и нажмите «Связать демонстрационный ФСП ID». Junior сохраняется. У работодателя заново сформируйте подборку с параметрами из шага 2 и без требования HTTP / API: у вашего кандидата общий балл увеличится с 90 до 96 за счёт ФСП. Это демонстрационная интеграция, без подключения к официальному реестру.</w:t>
+        <w:t>- Критерии: «Ограничение повторов, задержка между ними, защита от дублей».</w:t>
       </w:r>
     </w:p>
     <w:p>
       <w:r>
-        <w:t>Управление доступом. В «Моём профиле» кандидата отключите публикацию и сохраните. После обновления окна работодателя профиль исчезает из поиска, PDF недоступен, диалог закрыт. Включите публикацию обратно: старое согласие не восстанавливается. Для нового доступа отправьте ещё одно приглашение и примите его в окне кандидата. Эти действия в отдельном демопроходе не затрагивают других посетителей.</w:t>
+        <w:t>У кандидата в этом разделе найдите свой план, согласитесь на выдачу и отправьте ответ. Например: «Ограничиваю число повторов, увеличиваю задержку, использую ключ идемпотентности». У работодателя обновите задания, поставьте 85, добавьте обоснование и сохраните оценку. Кандидат увидит 85/100; профессиональный уровень не изменится.</w:t>
+      </w:r>
+    </w:p>
+    <w:p>
+      <w:r>
+        <w:t>Можно приостановить и снова включить выдачу. Это не создаёт немедленно второе задание: дата следующей выдачи указана в плане. Для завершения этой проверки нажмите «Закрыть план». Для нового упражнения создайте другой план.</w:t>
+      </w:r>
+    </w:p>
+    <w:p>
+      <w:r>
+        <w:t>Достижения ФСП. Откройте соответствующий раздел у кандидата. Если демонстрационный профиль ещё не связан, нажмите «Связать демонстрационный ФСП ID». Если уже связан, посмотрите имеющиеся достижения. Они добавляют баллы внутри категории, но не повышают Junior до Middle. После изменения заново сформируйте подборку работодателя. Подключение к официальному реестру здесь не используется.</w:t>
+      </w:r>
+    </w:p>
+    <w:p>
+      <w:r>
+        <w:t>Отзыв доступа — необязательная проверка. Отключите публикацию кандидата и сохраните профиль. Обновите окно работодателя: кандидат исчезнет из поиска, PDF и диалог станут недоступны. Затем включите публикацию обратно. Прежнее согласие на контакты при этом не возвращается: отправьте новое приглашение с отличимым текстом и примите его у кандидата. После этого общение снова доступно. В общих аккаунтах изменение видимости влияет и на других посетителей, проверяющих этого кандидата.</w:t>
       </w:r>
     </w:p>
     <w:p>
@@ -461,22 +441,214 @@
         <w:pStyle w:val="Heading2"/>
       </w:pPr>
       <w:r>
-        <w:t>Повторите проверку с начала</w:t>
+        <w:t>Как прерваться, продолжить и повторить</w:t>
       </w:r>
     </w:p>
     <w:p>
       <w:r>
-        <w:t>Выйдите из кабинетов. В первом окне нажмите «Начать ещё один демопроход» (или «Начать новый демопроход», если это новый браузер), скопируйте новую ссылку во второе окно и снова выберите роли. Не создавайте два отдельных прохода для двух ролей.</w:t>
+        <w:t>Сохранённый профиль, результаты тестов, отправленные приглашения, сообщения, ответы и оценки остаются на сервере. Можно закрыть вкладку и вернуться. Если вход закончился, снова нажмите «Я кандидат» или «Я работодатель» в соответствующем окне — откроются те же аккаунты. Все окна инкогнито после закрытия теряют вход; повторный вход восстанавливает доступ к сохранённым действиям.</w:t>
       </w:r>
     </w:p>
     <w:p>
       <w:r>
-        <w:t>Начальные состояния повторяются: Junior, результаты 100% и 50%, профиль опубликован, контакты скрыты, приглашений, диалогов, заданий и достижений ФСП нет. Идентификаторы, даты и числовые варианты заданий могут отличаться; правила, оценки и последовательность действий одинаковы. Старую ссылку можно сохранить для возврата к предыдущему проходу.</w:t>
+        <w:t>Продолжайте по текущему статусу:</w:t>
+      </w:r>
+    </w:p>
+    <w:tbl>
+      <w:tblPr>
+        <w:tblStyle w:val="LightShading-Accent1"/>
+        <w:tblW w:type="auto" w:w="0"/>
+        <w:tblLook w:firstColumn="1" w:firstRow="1" w:lastColumn="0" w:lastRow="0" w:noHBand="0" w:noVBand="1" w:val="04A0"/>
+      </w:tblPr>
+      <w:tblGrid>
+        <w:gridCol w:w="4320"/>
+        <w:gridCol w:w="4320"/>
+      </w:tblGrid>
+      <w:tr>
+        <w:trPr>
+          <w:tblHeader/>
+          <w:cantSplit/>
+        </w:trPr>
+        <w:tc>
+          <w:tcPr>
+            <w:tcW w:type="dxa" w:w="4320"/>
+          </w:tcPr>
+          <w:p>
+            <w:r>
+              <w:t>Что видно</w:t>
+            </w:r>
+          </w:p>
+        </w:tc>
+        <w:tc>
+          <w:tcPr>
+            <w:tcW w:type="dxa" w:w="4320"/>
+          </w:tcPr>
+          <w:p>
+            <w:r>
+              <w:t>Следующее действие</w:t>
+            </w:r>
+          </w:p>
+        </w:tc>
+      </w:tr>
+      <w:tr>
+        <w:trPr>
+          <w:cantSplit/>
+        </w:trPr>
+        <w:tc>
+          <w:tcPr>
+            <w:tcW w:type="dxa" w:w="4320"/>
+          </w:tcPr>
+          <w:p>
+            <w:r>
+              <w:t>Предложение отправлено</w:t>
+            </w:r>
+          </w:p>
+        </w:tc>
+        <w:tc>
+          <w:tcPr>
+            <w:tcW w:type="dxa" w:w="4320"/>
+          </w:tcPr>
+          <w:p>
+            <w:r>
+              <w:t>Найдите его у кандидата и примите</w:t>
+            </w:r>
+          </w:p>
+        </w:tc>
+      </w:tr>
+      <w:tr>
+        <w:trPr>
+          <w:cantSplit/>
+        </w:trPr>
+        <w:tc>
+          <w:tcPr>
+            <w:tcW w:type="dxa" w:w="4320"/>
+          </w:tcPr>
+          <w:p>
+            <w:r>
+              <w:t>Предложение принято</w:t>
+            </w:r>
+          </w:p>
+        </w:tc>
+        <w:tc>
+          <w:tcPr>
+            <w:tcW w:type="dxa" w:w="4320"/>
+          </w:tcPr>
+          <w:p>
+            <w:r>
+              <w:t>Откройте его диалог</w:t>
+            </w:r>
+          </w:p>
+        </w:tc>
+      </w:tr>
+      <w:tr>
+        <w:trPr>
+          <w:cantSplit/>
+        </w:trPr>
+        <w:tc>
+          <w:tcPr>
+            <w:tcW w:type="dxa" w:w="4320"/>
+          </w:tcPr>
+          <w:p>
+            <w:r>
+              <w:t>Ответ на задание «На проверке»</w:t>
+            </w:r>
+          </w:p>
+        </w:tc>
+        <w:tc>
+          <w:tcPr>
+            <w:tcW w:type="dxa" w:w="4320"/>
+          </w:tcPr>
+          <w:p>
+            <w:r>
+              <w:t>Поставьте оценку у работодателя</w:t>
+            </w:r>
+          </w:p>
+        </w:tc>
+      </w:tr>
+      <w:tr>
+        <w:trPr>
+          <w:cantSplit/>
+        </w:trPr>
+        <w:tc>
+          <w:tcPr>
+            <w:tcW w:type="dxa" w:w="4320"/>
+          </w:tcPr>
+          <w:p>
+            <w:r>
+              <w:t>Оценка уже сохранена</w:t>
+            </w:r>
+          </w:p>
+        </w:tc>
+        <w:tc>
+          <w:tcPr>
+            <w:tcW w:type="dxa" w:w="4320"/>
+          </w:tcPr>
+          <w:p>
+            <w:r>
+              <w:t>Посмотрите её у кандидата</w:t>
+            </w:r>
+          </w:p>
+        </w:tc>
+      </w:tr>
+      <w:tr>
+        <w:trPr>
+          <w:cantSplit/>
+        </w:trPr>
+        <w:tc>
+          <w:tcPr>
+            <w:tcW w:type="dxa" w:w="4320"/>
+          </w:tcPr>
+          <w:p>
+            <w:r>
+              <w:t>Выдача приостановлена</w:t>
+            </w:r>
+          </w:p>
+        </w:tc>
+        <w:tc>
+          <w:tcPr>
+            <w:tcW w:type="dxa" w:w="4320"/>
+          </w:tcPr>
+          <w:p>
+            <w:r>
+              <w:t>Включите её в том же плане при необходимости</w:t>
+            </w:r>
+          </w:p>
+        </w:tc>
+      </w:tr>
+      <w:tr>
+        <w:trPr>
+          <w:cantSplit/>
+        </w:trPr>
+        <w:tc>
+          <w:tcPr>
+            <w:tcW w:type="dxa" w:w="4320"/>
+          </w:tcPr>
+          <w:p>
+            <w:r>
+              <w:t>Профиль скрыт / доступ отозван</w:t>
+            </w:r>
+          </w:p>
+        </w:tc>
+        <w:tc>
+          <w:tcPr>
+            <w:tcW w:type="dxa" w:w="4320"/>
+          </w:tcPr>
+          <w:p>
+            <w:r>
+              <w:t>Включите публикацию, отправьте и примите новое приглашение</w:t>
+            </w:r>
+          </w:p>
+        </w:tc>
+      </w:tr>
+    </w:tbl>
+    <w:p>
+      <w:r>
+        <w:t>Текст, который вы ещё не сохранили или не отправили, не считается завершённым действием. Перед закрытием формы сохраните его. Срок уже начатого теста и срок задания продолжают идти после закрытия браузера; это не сброс истории.</w:t>
       </w:r>
     </w:p>
     <w:p>
       <w:r>
-        <w:t>Общий кандидат C7D0B82B на публичном стенде сохранён отдельно. Он доступен через обычные кнопки ролей без нового прохода; его история и действия прошлых посетителей не сбрасываются.</w:t>
+        <w:t>Чтобы повторить сценарий второй раз, используйте те же два окна и тот же номер кандидата. Повторите шаги 1–3, добавив в текст предложения «Проверка жюри — 2». Для задания используйте новое название. Предыдущие записи останутся, а новые появятся рядом с ними. Повторно подтверждать грейд или отвязывать ФСП не нужно.</w:t>
       </w:r>
     </w:p>
     <w:p>
@@ -484,22 +656,12 @@
         <w:pStyle w:val="Heading2"/>
       </w:pPr>
       <w:r>
-        <w:t>Если хотите пройти весь путь самостоятельно</w:t>
+        <w:t>Если хотите начать с собственного аккаунта</w:t>
       </w:r>
     </w:p>
     <w:p>
       <w:r>
-        <w:t>Зарегистрируйте кандидата и работодателя на двух доступных вам почтовых адресах, подтвердите их по ссылкам из писем. Заполните профиль кандидата и компанию работодателя.</w:t>
-      </w:r>
-    </w:p>
-    <w:p>
-      <w:r>
-        <w:t>У кандидата пройдите тест выбранного уровня, затем разрешите публикацию профиля. После успешного подтверждения уровня его можно найти со стороны работодателя и пройти сценарий приглашения выше. На сам тест отводится до 30 минут — этот вариант занимает больше времени, чем знакомство с готовыми примерами.</w:t>
-      </w:r>
-    </w:p>
-    <w:p>
-      <w:r>
-        <w:t>Если повторный тест недоступен, страница покажет причину и ближайшую дату. В общих демоаккаунтах это может быть следствием предыдущего прохождения. Если предложение или сообщение не появилось, обновите соответствующий раздел или страницу.</w:t>
+        <w:t>Зарегистрируйте кандидата и работодателя на двух доступных вам почтовых адресах, подтвердите почту, заполните профиль и компанию. Кандидату нужно пройти тест и разрешить публикацию. Затем используйте его номер для поиска работодателем. Этот вариант занимает больше времени и также требует двух независимых сессий.</w:t>
       </w:r>
     </w:p>
     <w:p>
@@ -507,17 +669,17 @@
         <w:pStyle w:val="Heading2"/>
       </w:pPr>
       <w:r>
-        <w:t>Материалы для подробной оценки</w:t>
+        <w:t>Материалы</w:t>
       </w:r>
     </w:p>
     <w:p>
       <w:r>
-        <w:t>Презентация (../../demo/FSP_FINAL_2026-10-21.pdf) · Архитектура (ARCHITECTURE.md) · Требования и реализация (REQUIREMENTS_STATUS.md) · Результаты проверок (VALIDATION.md) · Исходный код и запуск (../../README.md)</w:t>
+        <w:t>Презентация (../../demo/FSP_FINAL_2026-10-21.pdf) · Архитектура (ARCHITECTURE.md) · Требования (REQUIREMENTS_STATUS.md) · Проверки (VALIDATION.md) · Код и запуск (../../README.md)</w:t>
       </w:r>
     </w:p>
     <w:p>
       <w:r>
-        <w:t>Технические проверки и ручной проход на компьютере и Android описаны в отчётах. Оценка качества подбора и грейдов выполнена на синтетических сценариях; независимый пилот с людьми не проводился.</w:t>
+        <w:t>Оценка качества подбора и грейдов выполнена на синтетических сценариях. Независимый пилот с людьми не проводился.</w:t>
       </w:r>
     </w:p>
     <w:p>
@@ -526,47 +688,47 @@
         <w:pageBreakBefore/>
       </w:pPr>
       <w:r>
-        <w:t>Последние проверки: повторяемый сценарий и сессии</w:t>
+        <w:t>Последние проверки: два окна, повтор и продолжение</w:t>
       </w:r>
     </w:p>
     <w:p>
       <w:r>
-        <w:t>21 октября 2026. Машиночитаемый отчёт (evidence/repeatable_jury_2026-10-21.json) содержит результаты последнего прогона и его границы.</w:t>
+        <w:t>21 октября 2026. Машиночитаемый отчёт (evidence/jury_replay_2026-10-21.json).</w:t>
       </w:r>
     </w:p>
     <w:p>
       <w:r>
-        <w:t>- Сервер: 132 PASS, одно предупреждение устаревания в тестовой зависимости.</w:t>
+        <w:t>Серверный набор: 132 PASS, одно предупреждение устаревания в тестовой зависимости. Сборка TypeScript/Vite и контейнеров выполнена. Навигация: 11 групп — Back/Forward, прямые ссылки, черновики теста, приглашения, чат, выход и мобильное меню.</w:t>
       </w:r>
     </w:p>
     <w:p>
       <w:r>
-        <w:t>- Навигация: 11 групп PASS — переходы, Back/Forward, прямые ссылки, сохранение черновиков, выход и мобильное меню.</w:t>
+        <w:t>Полностью завершены два последовательных прохода на локальной базе и два на публичном сайте с C7D0B82B. По 10 групп проверок сессии и сбоев пройдены локально и публично; ошибок JavaScript нет.</w:t>
       </w:r>
     </w:p>
     <w:p>
       <w:r>
-        <w:t>- Полный сценарий жюри: два прохода на отдельной базе, одинаковые начальные состояния. Проверены история и объяснения, подбор и номер кандидата, согласие и PDF, чат, задание с оценкой 85/100, ФСП, скрытие профиля и повторное согласие.</w:t>
+        <w:t>Сквозная проверка использует два независимых браузерных контекста и те же аккаунты при повторе, без сброса данных. Проверяются история и объяснения, поиск по номеру, подбор, согласие и PDF, диалог в обе стороны, задание с оценкой 85/100, приостановка/возобновление, ФСП и отзыв/повторное согласие. В контрольных точках вкладка закрывается и открывается по сохранённому адресу; перед вторым повтором пересоздаются оба браузерных контекста с сохранёнными cookie.</w:t>
       </w:r>
     </w:p>
     <w:p>
       <w:r>
-        <w:t>- Сессии: 7 групп PASS на отдельной базе — сохранённый вход без повторной авторизации, независимая загрузка истории, ручной перезапуск зависшего запроса, тайм-аут и сетевые ошибки, смена роли и аккаунта во вкладках, восстановление страницы, истечение сессии.</w:t>
+        <w:t>Проверки сбоев включают HTTP 503 и зависание загрузки компании, ошибку первой загрузки заданий, таймаут истории, повторную загрузку, восстановленный/истёкший вход и смену аккаунта в соседней вкладке. Фактическое число завершённых проходов и проверок для локальной и публичной версий — в JSON выше.</w:t>
       </w:r>
     </w:p>
     <w:p>
       <w:r>
-        <w:t>- Итоговая проверка публичной версии и общего кандидата C7D0B82B — в отчёте. Общая история не пересоздавалась.</w:t>
-      </w:r>
-    </w:p>
-    <w:p>
-      <w:r>
-        <w:t>Воспроизведение на отдельной базе после npm run build --prefix apps/web:</w:t>
+        <w:t>Воспроизведение на отдельной базе после сборки frontend:</w:t>
       </w:r>
     </w:p>
     <w:p>
       <w:r>
         <w:t>bash</w:t>
+      </w:r>
+    </w:p>
+    <w:p>
+      <w:r>
+        <w:t>npm run build --prefix apps/web</w:t>
       </w:r>
     </w:p>
     <w:p>
@@ -587,7 +749,12 @@
     <w:p/>
     <w:p>
       <w:r>
-        <w:t>Второй и третий сценарии создают и удаляют только собственные временные базы. Проверка публичного демостенда выполняется tests/browser_jury.py --base-url URL --runs 2 и tests/browser_sessions.py --base-url URL; они создают новые вымышленные демопроходы и сохраняют результаты в audit/current/. Письма не отправляются; чужие профили и общий демопроход не сбрасываются.</w:t>
+        <w:t>Браузерные сценарии создают и удаляют только собственные временные базы. Для авторизованной проверки публичного демонстрационного стенда: tests/browser_jury.py --base-url URL --runs 2 и tests/browser_sessions.py --base-url URL. Первый добавляет помеченные вымышленные приглашения и задания в общие аккаунты, проверяет отзыв и восстановление доступа; старые записи не удаляет. Второй проверяет сессию и загрузку, не создавая бизнес-записей. Письма не отправляются. Не запускайте сквозной сценарий параллельно ручной проверке того же общего кандидата.</w:t>
+      </w:r>
+    </w:p>
+    <w:p>
+      <w:r>
+        <w:t>Проверка закрытия вкладки относится к уже сохранённым действиям. Не заявляется сохранение любого несохранённого текста, остановка сроков тестирования, отсутствие сбоев сети или изоляция посетителей, одновременно работающих в одном общем аккаунте. Независимый пилот и реальная доставка SMTP этим прогоном не проверяются.</w:t>
       </w:r>
     </w:p>
     <w:p>

</xml_diff>

<commit_message>
Show candidate profile and PDF download inside employer conversations
</commit_message>
<xml_diff>
--- a/docs/delivery/STAGE_A.docx
+++ b/docs/delivery/STAGE_A.docx
@@ -7,42 +7,22 @@
         <w:pStyle w:val="Heading1"/>
       </w:pPr>
       <w:r>
-        <w:t>Повторная проверка в двух независимых окнах</w:t>
+        <w:t>Профиль кандидата в переписке</w:t>
       </w:r>
     </w:p>
     <w:p>
       <w:r>
-        <w:t>21 октября 2026. Сценарий (FOR_JURY.md), протокол (STAGE_A_SMOKE.md).</w:t>
+        <w:t>21 октября 2026. В открытом диалоге работодателя добавлена карточка кандидата: имя и номер, специализация, подтверждённый уровень, стаж со слов кандидата, навыки и источники результатов. PDF скачивается прямо из карточки в диалоге. Используется тот же компонент, что в подборе, без кнопки повторного приглашения.</w:t>
       </w:r>
     </w:p>
     <w:p>
       <w:r>
-        <w:t>- Возвращён простой вход «Я кандидат» / «Я работодатель» в существующие общие аккаунты. Интерфейс создания демопроходов и переключатель ролей удалены. Для одновременной работы нужны обычное окно и инкогнито либо разные браузеры.</w:t>
+        <w:t>Профиль загружается отдельно от сообщений, обновляется при возврате в окно и периодически. Есть повторная загрузка при ошибке. После отзыва доступа карточка и ссылка скрываются; сервер повторно проверяет права при скачивании PDF. У кандидата лишняя карточка собственного профиля в переписке не показывается.</w:t>
       </w:r>
     </w:p>
     <w:p>
       <w:r>
-        <w:t>- Ошибку загрузки компании можно исправить кнопкой повторной загрузки прямо в приглашении, сохранив текст и зарплату. Зависший запрос отменяется; отправка доступна после загрузки компании.</w:t>
-      </w:r>
-    </w:p>
-    <w:p>
-      <w:r>
-        <w:t>- «Обновить задания» обновляет и задания, и список получателей после принятия приглашения. После ошибки первой загрузки кнопка остаётся доступна. Обновление также выполняется при возврате в окно.</w:t>
-      </w:r>
-    </w:p>
-    <w:p>
-      <w:r>
-        <w:t>- Восстановление сессии, защита от смешения аккаунтов, независимая загрузка истории и доступности теста сохранены. Существующие попытки не сбрасываются.</w:t>
-      </w:r>
-    </w:p>
-    <w:p>
-      <w:r>
-        <w:t>- Сценарий для жюри описывает продолжение по текущему статусу и повтор на тех же аккаунтах с новыми текстами предложений. Прежние сообщения и результаты остаются. Несохранённый текст формы и истекающий срок теста отдельно оговорены.</w:t>
-      </w:r>
-    </w:p>
-    <w:p>
-      <w:r>
-        <w:t>Результаты исполненных проверок и границы приведены в протоколе (STAGE_A_SMOKE.md). Следующие разделы — история прежних версий; инструкции по отдельным демопроходам из неё больше не относятся к интерфейсу.</w:t>
+        <w:t>Проверки: отчёт (evidence/chat_candidate_2026-10-21.json). Предыдущие изменения и результаты сохранены ниже.</w:t>
       </w:r>
     </w:p>
     <w:p>
@@ -385,7 +365,7 @@
     </w:p>
     <w:p>
       <w:r>
-        <w:t>5. В карточке кандидата скачайте PDF значком загрузки. При действующем согласии в нём есть контакты. Без согласия PDF содержит обезличенный профиль.</w:t>
+        <w:t>5. В открытом диалоге работодателя посмотрите блок «Профиль кандидата»: номер, специализация, уровень, навыки и результаты тестов. Здесь же нажмите «Скачать PDF профиля». PDF также доступен в карточке поиска. При действующем согласии он содержит контакты; без согласия в поиске доступен только обезличенный профиль.</w:t>
       </w:r>
     </w:p>
     <w:p>
@@ -688,7 +668,31 @@
         <w:pageBreakBefore/>
       </w:pPr>
       <w:r>
-        <w:t>Последние проверки: два окна, повтор и продолжение</w:t>
+        <w:t>Профиль и PDF в переписке</w:t>
+      </w:r>
+    </w:p>
+    <w:p>
+      <w:r>
+        <w:t>21 октября 2026. 13 групп браузерных проверок PASS, сборка frontend и Docker web успешна. Проверены общая карточка с подбором, скачивание PDF с разрешёнными контактами, отсутствие повторного приглашения, независимая ошибка загрузки профиля и повтор, отзыв доступа, прямой запрещённый PDF после отзыва и мобильный вид. На публичном стенде — существующий диалог C7D0B82B, PDF, обновление страницы и ширина 390 px, без отправки сообщений.</w:t>
+      </w:r>
+    </w:p>
+    <w:p>
+      <w:r>
+        <w:t>Воспроизведение: npm run build --prefix apps/web, затем .venv/bin/python scripts/run_local.py .venv/bin/python tests/browser_navigation.py. Используется временная база, которая удаляется после проверки. Отчёт (evidence/chat_candidate_2026-10-21.json). Backend не изменён; прежний полный прогон ниже.</w:t>
+      </w:r>
+    </w:p>
+    <w:p>
+      <w:r>
+        <w:t>---</w:t>
+      </w:r>
+    </w:p>
+    <w:p>
+      <w:pPr>
+        <w:pStyle w:val="Heading1"/>
+        <w:pageBreakBefore/>
+      </w:pPr>
+      <w:r>
+        <w:t>Предыдущие проверки: два окна, повтор и продолжение</w:t>
       </w:r>
     </w:p>
     <w:p>

</xml_diff>

<commit_message>
Refresh delivery documents after merging concurrent guide additions
</commit_message>
<xml_diff>
--- a/docs/delivery/STAGE_A.docx
+++ b/docs/delivery/STAGE_A.docx
@@ -649,6 +649,19 @@
         <w:pStyle w:val="Heading2"/>
       </w:pPr>
       <w:r>
+        <w:t>Закрытый контур / готовность к внедрению</w:t>
+      </w:r>
+    </w:p>
+    <w:p>
+      <w:r>
+        <w:t>Подготовлен комплект технического пилота у заказчика (closed_contour/READY_TO_DEPLOY_ONEPAGER.md) (установка, инфбез, границы ПДн/ТД). Публичный демо-стенд остаётся доступным; приёмка инфраструктуры и юридических условий заказчика ещё требуется. Подробный handoff: HANDOFF_CLOSED_CONTOUR.md (closed_contour/HANDOFF_CLOSED_CONTOUR.md).</w:t>
+      </w:r>
+    </w:p>
+    <w:p>
+      <w:pPr>
+        <w:pStyle w:val="Heading2"/>
+      </w:pPr>
+      <w:r>
         <w:t>Материалы</w:t>
       </w:r>
     </w:p>

</xml_diff>

<commit_message>
Document demo inactivity reset and regression evidence
</commit_message>
<xml_diff>
--- a/docs/delivery/STAGE_A.docx
+++ b/docs/delivery/STAGE_A.docx
@@ -7,22 +7,17 @@
         <w:pStyle w:val="Heading1"/>
       </w:pPr>
       <w:r>
-        <w:t>Профиль кандидата в переписке</w:t>
+        <w:t>Что изменилось после созвона и аудита</w:t>
       </w:r>
     </w:p>
     <w:p>
       <w:r>
-        <w:t>21 октября 2026. В открытом диалоге работодателя добавлена карточка кандидата: имя и номер, специализация, подтверждённый уровень, стаж со слов кандидата, навыки и источники результатов. PDF скачивается прямо из карточки в диалоге. Используется тот же компонент, что в подборе, без кнопки повторного приглашения.</w:t>
+        <w:t>21 октября 2026. Кратко для проверки стенда со скриншотами аудита: AFTER_ORGANIZERS_CALL_2026-10-21.md (AFTER_ORGANIZERS_CALL_2026-10-21.md). Ниже — подробная история изменений.</w:t>
       </w:r>
     </w:p>
     <w:p>
       <w:r>
-        <w:t>Профиль загружается отдельно от сообщений, обновляется при возврате в окно и периодически. Есть повторная загрузка при ошибке. После отзыва доступа карточка и ссылка скрываются; сервер повторно проверяет права при скачивании PDF. У кандидата лишняя карточка собственного профиля в переписке не показывается.</w:t>
-      </w:r>
-    </w:p>
-    <w:p>
-      <w:r>
-        <w:t>Проверки: отчёт (evidence/chat_candidate_2026-10-21.json). Предыдущие изменения и результаты сохранены ниже.</w:t>
+        <w:t>Общие демоаккаунты теперь возвращаются к исходному примеру после часа без действий в обоих аккаунтах. Исходные примеры тестов сохраняются; пробная переписка, приглашения, подборки и задания очищаются. Правила и эксплуатация (DEMO_ACCOUNTS.md).</w:t>
       </w:r>
     </w:p>
     <w:p>
@@ -37,6 +32,11 @@
     <w:p>
       <w:r>
         <w:t>Открыть сайт (https://85-137-26-131.sslip.io/)</w:t>
+      </w:r>
+    </w:p>
+    <w:p>
+      <w:r>
+        <w:t>&gt; После созвона с организаторами и аудита 20.10 стенд доработан. Кратко, что изменилось, со скриншотами «как было»: AFTER_ORGANIZERS_CALL_2026-10-21.md (AFTER_ORGANIZERS_CALL_2026-10-21.md).</w:t>
       </w:r>
     </w:p>
     <w:p>
@@ -79,7 +79,7 @@
     </w:p>
     <w:p>
       <w:r>
-        <w:t>Аккаунты общие: предыдущие приглашения, сообщения и результаты могут уже присутствовать. Они не сбрасываются при входе. Используйте только вымышленные данные.</w:t>
+        <w:t>Аккаунты общие: предыдущие приглашения, сообщения и результаты могут уже присутствовать. Пока кто-либо работает в любом из двух аккаунтов, действия сохраняются. После часа без действий в обоих аккаунтах система автоматически возвращает их в исходное состояние: удаляет пробные приглашения, переписку, подборки и задания, восстанавливает профили и начальные примеры тестов. Проверка выполняется раз в минуту; при следующем входе просроченный сброс выполняется сразу. Поэтому после длительного перерыва начните сценарий заново. Открытая вкладка без действий и фоновое обновление данных не продлевают этот час. Обычные зарегистрированные аккаунты не сбрасываются. Используйте только вымышленные данные. Подробнее об очистке демоаккаунтов (DEMO_ACCOUNTS.md).</w:t>
       </w:r>
     </w:p>
     <w:p>
@@ -662,12 +662,40 @@
         <w:pStyle w:val="Heading2"/>
       </w:pPr>
       <w:r>
+        <w:t>Если отдельно проверить правки после аудита</w:t>
+      </w:r>
+    </w:p>
+    <w:p>
+      <w:r>
+        <w:t>Основной сценарий выше уже затрагивает подбор, приглашение, чат, PDF и отзыв доступа. Ниже — только то, что удобно проверить отдельно, если есть время.</w:t>
+      </w:r>
+    </w:p>
+    <w:p>
+      <w:r>
+        <w:t>Черновик теста. В «Подтверждение навыков» начните или продолжите попытку, введите короткий ответ, перейдите в «Обзор» и вернитесь: ответ должен остаться. Если новая попытка сейчас недоступна из‑за срока пересдачи, откройте «Посмотреть» у завершённой попытки в истории.</w:t>
+      </w:r>
+    </w:p>
+    <w:p>
+      <w:r>
+        <w:t>Сдача с пропусками. При незаполненных заданиях перед завершением должно появиться подтверждение с числом пустых; отмена не закрывает попытку. Если начать тест сейчас нельзя — этот шаг отложите.</w:t>
+      </w:r>
+    </w:p>
+    <w:p>
+      <w:r>
+        <w:t>Скриншоты проблем до правок и сводка изменений: AFTER_ORGANIZERS_CALL_2026-10-21.md (AFTER_ORGANIZERS_CALL_2026-10-21.md).</w:t>
+      </w:r>
+    </w:p>
+    <w:p>
+      <w:pPr>
+        <w:pStyle w:val="Heading2"/>
+      </w:pPr>
+      <w:r>
         <w:t>Материалы</w:t>
       </w:r>
     </w:p>
     <w:p>
       <w:r>
-        <w:t>Презентация (../../demo/FSP_FINAL_2026-10-21.pdf) · Архитектура (ARCHITECTURE.md) · Требования (REQUIREMENTS_STATUS.md) · Проверки (VALIDATION.md) · Код и запуск (../../README.md)</w:t>
+        <w:t>Что изменилось после созвона и аудита (AFTER_ORGANIZERS_CALL_2026-10-21.md) · Презентация (../../demo/FSP_FINAL_2026-10-21.pdf) · Архитектура (ARCHITECTURE.md) · Требования (REQUIREMENTS_STATUS.md) · Проверки (VALIDATION.md) · Код и запуск (../../README.md)</w:t>
       </w:r>
     </w:p>
     <w:p>

</xml_diff>

<commit_message>
Record live demo reset activation and refresh delivery documents
</commit_message>
<xml_diff>
--- a/docs/delivery/STAGE_A.docx
+++ b/docs/delivery/STAGE_A.docx
@@ -649,20 +649,7 @@
         <w:pStyle w:val="Heading2"/>
       </w:pPr>
       <w:r>
-        <w:t>Закрытый контур / готовность к внедрению</w:t>
-      </w:r>
-    </w:p>
-    <w:p>
-      <w:r>
-        <w:t>Подготовлен комплект технического пилота у заказчика (closed_contour/READY_TO_DEPLOY_ONEPAGER.md) (установка, инфбез, границы ПДн/ТД). Публичный демо-стенд остаётся доступным; приёмка инфраструктуры и юридических условий заказчика ещё требуется. Подробный handoff: HANDOFF_CLOSED_CONTOUR.md (closed_contour/HANDOFF_CLOSED_CONTOUR.md).</w:t>
-      </w:r>
-    </w:p>
-    <w:p>
-      <w:pPr>
-        <w:pStyle w:val="Heading2"/>
-      </w:pPr>
-      <w:r>
-        <w:t>Если отдельно проверить правки после аудита</w:t>
+        <w:t>Дополнительно: правки после аудита</w:t>
       </w:r>
     </w:p>
     <w:p>
@@ -690,6 +677,19 @@
         <w:pStyle w:val="Heading2"/>
       </w:pPr>
       <w:r>
+        <w:t>Закрытый контур / готовность к внедрению</w:t>
+      </w:r>
+    </w:p>
+    <w:p>
+      <w:r>
+        <w:t>Подготовлен комплект технического пилота у заказчика (closed_contour/READY_TO_DEPLOY_ONEPAGER.md) (установка, инфбез, границы ПДн/ТД). Публичный демо-стенд остаётся доступным; приёмка инфраструктуры и юридических условий заказчика ещё требуется. Подробный handoff: HANDOFF_CLOSED_CONTOUR.md (closed_contour/HANDOFF_CLOSED_CONTOUR.md).</w:t>
+      </w:r>
+    </w:p>
+    <w:p>
+      <w:pPr>
+        <w:pStyle w:val="Heading2"/>
+      </w:pPr>
+      <w:r>
         <w:t>Материалы</w:t>
       </w:r>
     </w:p>
@@ -701,6 +701,25 @@
     <w:p>
       <w:r>
         <w:t>Оценка качества подбора и грейдов выполнена на синтетических сценариях. Независимый пилот с людьми не проводился.</w:t>
+      </w:r>
+    </w:p>
+    <w:p>
+      <w:pPr>
+        <w:pStyle w:val="Heading1"/>
+        <w:pageBreakBefore/>
+      </w:pPr>
+      <w:r>
+        <w:t>Автоматическое восстановление демоаккаунтов</w:t>
+      </w:r>
+    </w:p>
+    <w:p>
+      <w:r>
+        <w:t>21 октября 2026. 138 серверных тестов PASS, 13 групп браузерной регрессии, два последовательных полного прохода сценария и 10 групп восстановления сессий. Дополнительно Chromium проверил два сброса подряд в сохранённой сессии и различие между действиями пользователя и фоновым опросом. Сброс проверялся только на временной базе. Отчёт (evidence/demo_idle_2026-10-21.json), правила (DEMO_ACCOUNTS.md).</w:t>
+      </w:r>
+    </w:p>
+    <w:p>
+      <w:r>
+        <w:t>---</w:t>
       </w:r>
     </w:p>
     <w:p>

</xml_diff>